<commit_message>
Analiza res1024 y actualiza los informes de entrenamiento (T15–T20)
</commit_message>
<xml_diff>
--- a/docs/informes/informe_completo_fases_1_2.docx
+++ b/docs/informes/informe_completo_fases_1_2.docx
@@ -336,7 +336,7 @@
     </w:p>
     <w:p>
       <w:r>
-        <w:t>Contenido actualizado el 15 de octubre de 2026. Grupo 2 según el usuario pids2; confirmar identificación administrativa y fecha de entrega.</w:t>
+        <w:t>Contenido actualizado el 16 de octubre de 2026. Grupo 2 según el usuario pids2; confirmar identificación administrativa y fecha de entrega.</w:t>
       </w:r>
     </w:p>
     <w:p>
@@ -1271,7 +1271,7 @@
         </w:rPr>
         <w:t>12. Análisis cualitativo</w:t>
         <w:tab/>
-        <w:t>17</w:t>
+        <w:t>19</w:t>
       </w:r>
     </w:p>
     <w:p>
@@ -1288,7 +1288,7 @@
         </w:rPr>
         <w:t>13. Módulos del robot</w:t>
         <w:tab/>
-        <w:t>19</w:t>
+        <w:t>21</w:t>
       </w:r>
     </w:p>
     <w:p>
@@ -1305,7 +1305,7 @@
         </w:rPr>
         <w:t>14. El circuito</w:t>
         <w:tab/>
-        <w:t>19</w:t>
+        <w:t>21</w:t>
       </w:r>
     </w:p>
     <w:p>
@@ -1322,7 +1322,7 @@
         </w:rPr>
         <w:t>15. Estrategia de búsqueda y detección</w:t>
         <w:tab/>
-        <w:t>19</w:t>
+        <w:t>21</w:t>
       </w:r>
     </w:p>
     <w:p>
@@ -1339,7 +1339,7 @@
         </w:rPr>
         <w:t>16. Funcionalidades adicionales</w:t>
         <w:tab/>
-        <w:t>19</w:t>
+        <w:t>21</w:t>
       </w:r>
     </w:p>
     <w:p>
@@ -1356,7 +1356,7 @@
         </w:rPr>
         <w:t>17. La demostración final</w:t>
         <w:tab/>
-        <w:t>19</w:t>
+        <w:t>21</w:t>
       </w:r>
     </w:p>
     <w:p>
@@ -1373,7 +1373,7 @@
         </w:rPr>
         <w:t>18. Limitaciones y trabajo futuro</w:t>
         <w:tab/>
-        <w:t>19</w:t>
+        <w:t>21</w:t>
       </w:r>
     </w:p>
     <w:p>
@@ -1390,7 +1390,7 @@
         </w:rPr>
         <w:t>Referencias</w:t>
         <w:tab/>
-        <w:t>20</w:t>
+        <w:t>22</w:t>
       </w:r>
       <w:r>
         <w:fldChar w:fldCharType="end"/>
@@ -6578,7 +6578,7 @@
     </w:p>
     <w:p>
       <w:r>
-        <w:t>La imagen se carga en RGB, se pasa a tensor en [0,1] y el modelo normaliza y escala internamente. Un batch es el lote de 8 imágenes que produce una actualización; una época recorre todo el entrenamiento. El lote limita memoria y permite estimar gradientes sin cargar el conjunto completo en GPU. Se suman las pérdidas de RPN, clasificación y regresión; SGD actualiza los pesos mediante retropropagación.</w:t>
+        <w:t>La imagen se carga en RGB, se pasa a tensor en [0,1] y el modelo normaliza y escala internamente. Los primeros experimentos usan lote físico 8; res1024 acumula dos microbatches de 4 antes de actualizar. Una época recorre todo entrenamiento. Se suman las pérdidas de RPN, clasificación y regresión; SGD actualiza los pesos mediante retropropagación.</w:t>
       </w:r>
     </w:p>
     <w:p>
@@ -6729,7 +6729,7 @@
                 <w:rFonts w:ascii="Calibri" w:hAnsi="Calibri"/>
                 <w:sz w:val="20"/>
               </w:rPr>
-              <w:t>Épocas / lote / semilla</w:t>
+              <w:t>Épocas / lote efectivo / semilla</w:t>
             </w:r>
           </w:p>
         </w:tc>
@@ -6761,7 +6761,7 @@
                 <w:rFonts w:ascii="Calibri" w:hAnsi="Calibri"/>
                 <w:sz w:val="20"/>
               </w:rPr>
-              <w:t>30 / 8 / 0</w:t>
+              <w:t>30 / 8 / 0; res1024: microbatch 4 × 2</w:t>
             </w:r>
           </w:p>
         </w:tc>
@@ -6899,7 +6899,7 @@
                 <w:rFonts w:ascii="Calibri" w:hAnsi="Calibri"/>
                 <w:sz w:val="20"/>
               </w:rPr>
-              <w:t>0,0001 en originales; 0,001 en lr001</w:t>
+              <w:t>0,0001 en originales; 0,001 en lr001 y res1024</w:t>
             </w:r>
           </w:p>
         </w:tc>
@@ -7106,7 +7106,7 @@
                 <w:rFonts w:ascii="Calibri" w:hAnsi="Calibri"/>
                 <w:sz w:val="20"/>
               </w:rPr>
-              <w:t>min_size=800; max_size=1333</w:t>
+              <w:t>800/1333; res1024: 1024/1820</w:t>
             </w:r>
           </w:p>
         </w:tc>
@@ -7175,7 +7175,7 @@
                 <w:rFonts w:ascii="Calibri" w:hAnsi="Calibri"/>
                 <w:sz w:val="20"/>
               </w:rPr>
-              <w:t>Originales y 3 copias; sin aumento online</w:t>
+              <w:t>Originales y 3 copias; mismo aumento base</w:t>
             </w:r>
           </w:p>
         </w:tc>
@@ -8054,6 +8054,171 @@
                 <w:sz w:val="18"/>
               </w:rPr>
               <w:t>0,6302</w:t>
+            </w:r>
+          </w:p>
+        </w:tc>
+      </w:tr>
+      <w:tr>
+        <w:trPr>
+          <w:cantSplit/>
+        </w:trPr>
+        <w:tc>
+          <w:tcPr>
+            <w:tcW w:type="dxa" w:w="3061"/>
+            <w:vAlign w:val="center"/>
+            <w:tcBorders>
+              <w:top w:val="single" w:sz="4" w:color="D9D9D9"/>
+              <w:left w:val="single" w:sz="4" w:color="D9D9D9"/>
+              <w:bottom w:val="single" w:sz="4" w:color="D9D9D9"/>
+              <w:right w:val="single" w:sz="4" w:color="D9D9D9"/>
+            </w:tcBorders>
+            <w:tcMar>
+              <w:top w:w="65" w:type="dxa"/>
+              <w:bottom w:w="65" w:type="dxa"/>
+              <w:left w:w="65" w:type="dxa"/>
+              <w:right w:w="65" w:type="dxa"/>
+            </w:tcMar>
+            <w:shd w:fill="FFFFFF"/>
+          </w:tcPr>
+          <w:p>
+            <w:pPr>
+              <w:spacing w:after="40" w:before="40" w:line="252" w:lineRule="auto"/>
+              <w:jc w:val="left"/>
+            </w:pPr>
+            <w:r>
+              <w:rPr>
+                <w:rFonts w:ascii="Calibri" w:hAnsi="Calibri"/>
+                <w:sz w:val="18"/>
+              </w:rPr>
+              <w:t>lr 0,001 res1024</w:t>
+            </w:r>
+          </w:p>
+        </w:tc>
+        <w:tc>
+          <w:tcPr>
+            <w:tcW w:type="dxa" w:w="1247"/>
+            <w:vAlign w:val="center"/>
+            <w:tcBorders>
+              <w:top w:val="single" w:sz="4" w:color="D9D9D9"/>
+              <w:left w:val="single" w:sz="4" w:color="D9D9D9"/>
+              <w:bottom w:val="single" w:sz="4" w:color="D9D9D9"/>
+              <w:right w:val="single" w:sz="4" w:color="D9D9D9"/>
+            </w:tcBorders>
+            <w:tcMar>
+              <w:top w:w="65" w:type="dxa"/>
+              <w:bottom w:w="65" w:type="dxa"/>
+              <w:left w:w="65" w:type="dxa"/>
+              <w:right w:w="65" w:type="dxa"/>
+            </w:tcMar>
+            <w:shd w:fill="FFFFFF"/>
+          </w:tcPr>
+          <w:p>
+            <w:pPr>
+              <w:spacing w:after="40" w:before="40" w:line="252" w:lineRule="auto"/>
+              <w:jc w:val="left"/>
+            </w:pPr>
+            <w:r>
+              <w:rPr>
+                <w:rFonts w:ascii="Calibri" w:hAnsi="Calibri"/>
+                <w:sz w:val="18"/>
+              </w:rPr>
+              <w:t>2</w:t>
+            </w:r>
+          </w:p>
+        </w:tc>
+        <w:tc>
+          <w:tcPr>
+            <w:tcW w:type="dxa" w:w="1587"/>
+            <w:vAlign w:val="center"/>
+            <w:tcBorders>
+              <w:top w:val="single" w:sz="4" w:color="D9D9D9"/>
+              <w:left w:val="single" w:sz="4" w:color="D9D9D9"/>
+              <w:bottom w:val="single" w:sz="4" w:color="D9D9D9"/>
+              <w:right w:val="single" w:sz="4" w:color="D9D9D9"/>
+            </w:tcBorders>
+            <w:tcMar>
+              <w:top w:w="65" w:type="dxa"/>
+              <w:bottom w:w="65" w:type="dxa"/>
+              <w:left w:w="65" w:type="dxa"/>
+              <w:right w:w="65" w:type="dxa"/>
+            </w:tcMar>
+            <w:shd w:fill="FFFFFF"/>
+          </w:tcPr>
+          <w:p>
+            <w:pPr>
+              <w:spacing w:after="40" w:before="40" w:line="252" w:lineRule="auto"/>
+              <w:jc w:val="left"/>
+            </w:pPr>
+            <w:r>
+              <w:rPr>
+                <w:rFonts w:ascii="Calibri" w:hAnsi="Calibri"/>
+                <w:sz w:val="18"/>
+              </w:rPr>
+              <w:t>0,9464</w:t>
+            </w:r>
+          </w:p>
+        </w:tc>
+        <w:tc>
+          <w:tcPr>
+            <w:tcW w:type="dxa" w:w="1587"/>
+            <w:vAlign w:val="center"/>
+            <w:tcBorders>
+              <w:top w:val="single" w:sz="4" w:color="D9D9D9"/>
+              <w:left w:val="single" w:sz="4" w:color="D9D9D9"/>
+              <w:bottom w:val="single" w:sz="4" w:color="D9D9D9"/>
+              <w:right w:val="single" w:sz="4" w:color="D9D9D9"/>
+            </w:tcBorders>
+            <w:tcMar>
+              <w:top w:w="65" w:type="dxa"/>
+              <w:bottom w:w="65" w:type="dxa"/>
+              <w:left w:w="65" w:type="dxa"/>
+              <w:right w:w="65" w:type="dxa"/>
+            </w:tcMar>
+            <w:shd w:fill="FFFFFF"/>
+          </w:tcPr>
+          <w:p>
+            <w:pPr>
+              <w:spacing w:after="40" w:before="40" w:line="252" w:lineRule="auto"/>
+              <w:jc w:val="left"/>
+            </w:pPr>
+            <w:r>
+              <w:rPr>
+                <w:rFonts w:ascii="Calibri" w:hAnsi="Calibri"/>
+                <w:sz w:val="18"/>
+              </w:rPr>
+              <w:t>0,9465</w:t>
+            </w:r>
+          </w:p>
+        </w:tc>
+        <w:tc>
+          <w:tcPr>
+            <w:tcW w:type="dxa" w:w="1587"/>
+            <w:vAlign w:val="center"/>
+            <w:tcBorders>
+              <w:top w:val="single" w:sz="4" w:color="D9D9D9"/>
+              <w:left w:val="single" w:sz="4" w:color="D9D9D9"/>
+              <w:bottom w:val="single" w:sz="4" w:color="D9D9D9"/>
+              <w:right w:val="single" w:sz="4" w:color="D9D9D9"/>
+            </w:tcBorders>
+            <w:tcMar>
+              <w:top w:w="65" w:type="dxa"/>
+              <w:bottom w:w="65" w:type="dxa"/>
+              <w:left w:w="65" w:type="dxa"/>
+              <w:right w:w="65" w:type="dxa"/>
+            </w:tcMar>
+            <w:shd w:fill="FFFFFF"/>
+          </w:tcPr>
+          <w:p>
+            <w:pPr>
+              <w:spacing w:after="40" w:before="40" w:line="252" w:lineRule="auto"/>
+              <w:jc w:val="left"/>
+            </w:pPr>
+            <w:r>
+              <w:rPr>
+                <w:rFonts w:ascii="Calibri" w:hAnsi="Calibri"/>
+                <w:sz w:val="18"/>
+              </w:rPr>
+              <w:t>0,6047</w:t>
             </w:r>
           </w:p>
         </w:tc>
@@ -9163,7 +9328,7 @@
     </w:p>
     <w:p>
       <w:r>
-        <w:t>La mejora principal está en localizar mejor las cajas. AP50 ya era alto y su incremento es pequeño. La ganancia en objetos pequeños es modesta y sigue siendo el principal punto débil; esto justifica estudiar una mayor resolución como siguiente experimento.</w:t>
+        <w:t>El cambio de tasa mejora sobre todo el ajuste de cajas. AP50 ya era alto y su incremento es pequeño. La ganancia modesta en objetos pequeños motivó el experimento de resolución de los apartados 11.5 y 11.6.</w:t>
       </w:r>
     </w:p>
     <w:p>
@@ -9182,9 +9347,10 @@
         <w:tblLook w:firstColumn="1" w:firstRow="1" w:lastColumn="0" w:lastRow="0" w:noHBand="0" w:noVBand="1" w:val="04A0"/>
       </w:tblPr>
       <w:tblGrid>
-        <w:gridCol w:w="4535"/>
-        <w:gridCol w:w="2268"/>
-        <w:gridCol w:w="2268"/>
+        <w:gridCol w:w="3628"/>
+        <w:gridCol w:w="1814"/>
+        <w:gridCol w:w="1814"/>
+        <w:gridCol w:w="1814"/>
       </w:tblGrid>
       <w:tr>
         <w:trPr>
@@ -9193,7 +9359,7 @@
         </w:trPr>
         <w:tc>
           <w:tcPr>
-            <w:tcW w:type="dxa" w:w="4535"/>
+            <w:tcW w:type="dxa" w:w="3628"/>
             <w:vAlign w:val="center"/>
             <w:tcBorders>
               <w:top w:val="single" w:sz="4" w:color="D9D9D9"/>
@@ -9219,15 +9385,15 @@
                 <w:rFonts w:ascii="Calibri" w:hAnsi="Calibri"/>
                 <w:b/>
                 <w:color w:val="FFFFFF"/>
-                <w:sz w:val="20"/>
+                <w:sz w:val="18"/>
               </w:rPr>
-              <w:t>Confianza ≥0,5 e IoU ≥0,5</w:t>
+              <w:t>Confianza e IoU ≥0,5</w:t>
             </w:r>
           </w:p>
         </w:tc>
         <w:tc>
           <w:tcPr>
-            <w:tcW w:type="dxa" w:w="2268"/>
+            <w:tcW w:type="dxa" w:w="1814"/>
             <w:vAlign w:val="center"/>
             <w:tcBorders>
               <w:top w:val="single" w:sz="4" w:color="D9D9D9"/>
@@ -9253,7 +9419,7 @@
                 <w:rFonts w:ascii="Calibri" w:hAnsi="Calibri"/>
                 <w:b/>
                 <w:color w:val="FFFFFF"/>
-                <w:sz w:val="20"/>
+                <w:sz w:val="18"/>
               </w:rPr>
               <w:t>lr 0,0001</w:t>
             </w:r>
@@ -9261,7 +9427,7 @@
         </w:tc>
         <w:tc>
           <w:tcPr>
-            <w:tcW w:type="dxa" w:w="2268"/>
+            <w:tcW w:type="dxa" w:w="1814"/>
             <w:vAlign w:val="center"/>
             <w:tcBorders>
               <w:top w:val="single" w:sz="4" w:color="D9D9D9"/>
@@ -9287,9 +9453,43 @@
                 <w:rFonts w:ascii="Calibri" w:hAnsi="Calibri"/>
                 <w:b/>
                 <w:color w:val="FFFFFF"/>
-                <w:sz w:val="20"/>
+                <w:sz w:val="18"/>
               </w:rPr>
               <w:t>lr 0,001</w:t>
+            </w:r>
+          </w:p>
+        </w:tc>
+        <w:tc>
+          <w:tcPr>
+            <w:tcW w:type="dxa" w:w="1814"/>
+            <w:vAlign w:val="center"/>
+            <w:tcBorders>
+              <w:top w:val="single" w:sz="4" w:color="D9D9D9"/>
+              <w:left w:val="single" w:sz="4" w:color="D9D9D9"/>
+              <w:bottom w:val="single" w:sz="4" w:color="D9D9D9"/>
+              <w:right w:val="single" w:sz="4" w:color="D9D9D9"/>
+            </w:tcBorders>
+            <w:tcMar>
+              <w:top w:w="65" w:type="dxa"/>
+              <w:bottom w:w="65" w:type="dxa"/>
+              <w:left w:w="65" w:type="dxa"/>
+              <w:right w:w="65" w:type="dxa"/>
+            </w:tcMar>
+            <w:shd w:fill="203B65"/>
+          </w:tcPr>
+          <w:p>
+            <w:pPr>
+              <w:spacing w:after="40" w:before="40" w:line="252" w:lineRule="auto"/>
+              <w:jc w:val="left"/>
+            </w:pPr>
+            <w:r>
+              <w:rPr>
+                <w:rFonts w:ascii="Calibri" w:hAnsi="Calibri"/>
+                <w:b/>
+                <w:color w:val="FFFFFF"/>
+                <w:sz w:val="18"/>
+              </w:rPr>
+              <w:t>res1024</w:t>
             </w:r>
           </w:p>
         </w:tc>
@@ -9300,7 +9500,7 @@
         </w:trPr>
         <w:tc>
           <w:tcPr>
-            <w:tcW w:type="dxa" w:w="4535"/>
+            <w:tcW w:type="dxa" w:w="3628"/>
             <w:vAlign w:val="center"/>
             <w:tcBorders>
               <w:top w:val="single" w:sz="4" w:color="D9D9D9"/>
@@ -9324,7 +9524,7 @@
             <w:r>
               <w:rPr>
                 <w:rFonts w:ascii="Calibri" w:hAnsi="Calibri"/>
-                <w:sz w:val="20"/>
+                <w:sz w:val="18"/>
               </w:rPr>
               <w:t>TP / FN</w:t>
             </w:r>
@@ -9332,7 +9532,7 @@
         </w:tc>
         <w:tc>
           <w:tcPr>
-            <w:tcW w:type="dxa" w:w="2268"/>
+            <w:tcW w:type="dxa" w:w="1814"/>
             <w:vAlign w:val="center"/>
             <w:tcBorders>
               <w:top w:val="single" w:sz="4" w:color="D9D9D9"/>
@@ -9356,7 +9556,7 @@
             <w:r>
               <w:rPr>
                 <w:rFonts w:ascii="Calibri" w:hAnsi="Calibri"/>
-                <w:sz w:val="20"/>
+                <w:sz w:val="18"/>
               </w:rPr>
               <w:t>1478 / 83</w:t>
             </w:r>
@@ -9364,7 +9564,7 @@
         </w:tc>
         <w:tc>
           <w:tcPr>
-            <w:tcW w:type="dxa" w:w="2268"/>
+            <w:tcW w:type="dxa" w:w="1814"/>
             <w:vAlign w:val="center"/>
             <w:tcBorders>
               <w:top w:val="single" w:sz="4" w:color="D9D9D9"/>
@@ -9388,9 +9588,41 @@
             <w:r>
               <w:rPr>
                 <w:rFonts w:ascii="Calibri" w:hAnsi="Calibri"/>
-                <w:sz w:val="20"/>
+                <w:sz w:val="18"/>
               </w:rPr>
               <w:t>1478 / 83</w:t>
+            </w:r>
+          </w:p>
+        </w:tc>
+        <w:tc>
+          <w:tcPr>
+            <w:tcW w:type="dxa" w:w="1814"/>
+            <w:vAlign w:val="center"/>
+            <w:tcBorders>
+              <w:top w:val="single" w:sz="4" w:color="D9D9D9"/>
+              <w:left w:val="single" w:sz="4" w:color="D9D9D9"/>
+              <w:bottom w:val="single" w:sz="4" w:color="D9D9D9"/>
+              <w:right w:val="single" w:sz="4" w:color="D9D9D9"/>
+            </w:tcBorders>
+            <w:tcMar>
+              <w:top w:w="65" w:type="dxa"/>
+              <w:bottom w:w="65" w:type="dxa"/>
+              <w:left w:w="65" w:type="dxa"/>
+              <w:right w:w="65" w:type="dxa"/>
+            </w:tcMar>
+            <w:shd w:fill="F1F4F8"/>
+          </w:tcPr>
+          <w:p>
+            <w:pPr>
+              <w:spacing w:after="40" w:before="40" w:line="252" w:lineRule="auto"/>
+              <w:jc w:val="left"/>
+            </w:pPr>
+            <w:r>
+              <w:rPr>
+                <w:rFonts w:ascii="Calibri" w:hAnsi="Calibri"/>
+                <w:sz w:val="18"/>
+              </w:rPr>
+              <w:t>1493 / 68</w:t>
             </w:r>
           </w:p>
         </w:tc>
@@ -9401,7 +9633,7 @@
         </w:trPr>
         <w:tc>
           <w:tcPr>
-            <w:tcW w:type="dxa" w:w="4535"/>
+            <w:tcW w:type="dxa" w:w="3628"/>
             <w:vAlign w:val="center"/>
             <w:tcBorders>
               <w:top w:val="single" w:sz="4" w:color="D9D9D9"/>
@@ -9425,7 +9657,7 @@
             <w:r>
               <w:rPr>
                 <w:rFonts w:ascii="Calibri" w:hAnsi="Calibri"/>
-                <w:sz w:val="20"/>
+                <w:sz w:val="18"/>
               </w:rPr>
               <w:t>FN normales / difficult</w:t>
             </w:r>
@@ -9433,7 +9665,7 @@
         </w:tc>
         <w:tc>
           <w:tcPr>
-            <w:tcW w:type="dxa" w:w="2268"/>
+            <w:tcW w:type="dxa" w:w="1814"/>
             <w:vAlign w:val="center"/>
             <w:tcBorders>
               <w:top w:val="single" w:sz="4" w:color="D9D9D9"/>
@@ -9457,7 +9689,7 @@
             <w:r>
               <w:rPr>
                 <w:rFonts w:ascii="Calibri" w:hAnsi="Calibri"/>
-                <w:sz w:val="20"/>
+                <w:sz w:val="18"/>
               </w:rPr>
               <w:t>20 / 63</w:t>
             </w:r>
@@ -9465,7 +9697,7 @@
         </w:tc>
         <w:tc>
           <w:tcPr>
-            <w:tcW w:type="dxa" w:w="2268"/>
+            <w:tcW w:type="dxa" w:w="1814"/>
             <w:vAlign w:val="center"/>
             <w:tcBorders>
               <w:top w:val="single" w:sz="4" w:color="D9D9D9"/>
@@ -9489,9 +9721,41 @@
             <w:r>
               <w:rPr>
                 <w:rFonts w:ascii="Calibri" w:hAnsi="Calibri"/>
-                <w:sz w:val="20"/>
+                <w:sz w:val="18"/>
               </w:rPr>
               <w:t>18 / 65</w:t>
+            </w:r>
+          </w:p>
+        </w:tc>
+        <w:tc>
+          <w:tcPr>
+            <w:tcW w:type="dxa" w:w="1814"/>
+            <w:vAlign w:val="center"/>
+            <w:tcBorders>
+              <w:top w:val="single" w:sz="4" w:color="D9D9D9"/>
+              <w:left w:val="single" w:sz="4" w:color="D9D9D9"/>
+              <w:bottom w:val="single" w:sz="4" w:color="D9D9D9"/>
+              <w:right w:val="single" w:sz="4" w:color="D9D9D9"/>
+            </w:tcBorders>
+            <w:tcMar>
+              <w:top w:w="65" w:type="dxa"/>
+              <w:bottom w:w="65" w:type="dxa"/>
+              <w:left w:w="65" w:type="dxa"/>
+              <w:right w:w="65" w:type="dxa"/>
+            </w:tcMar>
+            <w:shd w:fill="FFFFFF"/>
+          </w:tcPr>
+          <w:p>
+            <w:pPr>
+              <w:spacing w:after="40" w:before="40" w:line="252" w:lineRule="auto"/>
+              <w:jc w:val="left"/>
+            </w:pPr>
+            <w:r>
+              <w:rPr>
+                <w:rFonts w:ascii="Calibri" w:hAnsi="Calibri"/>
+                <w:sz w:val="18"/>
+              </w:rPr>
+              <w:t>12 / 56</w:t>
             </w:r>
           </w:p>
         </w:tc>
@@ -9502,7 +9766,7 @@
         </w:trPr>
         <w:tc>
           <w:tcPr>
-            <w:tcW w:type="dxa" w:w="4535"/>
+            <w:tcW w:type="dxa" w:w="3628"/>
             <w:vAlign w:val="center"/>
             <w:tcBorders>
               <w:top w:val="single" w:sz="4" w:color="D9D9D9"/>
@@ -9526,15 +9790,15 @@
             <w:r>
               <w:rPr>
                 <w:rFonts w:ascii="Calibri" w:hAnsi="Calibri"/>
-                <w:sz w:val="20"/>
+                <w:sz w:val="18"/>
               </w:rPr>
-              <w:t>FP frente a las etiquetas</w:t>
+              <w:t>FP frente a etiquetas</w:t>
             </w:r>
           </w:p>
         </w:tc>
         <w:tc>
           <w:tcPr>
-            <w:tcW w:type="dxa" w:w="2268"/>
+            <w:tcW w:type="dxa" w:w="1814"/>
             <w:vAlign w:val="center"/>
             <w:tcBorders>
               <w:top w:val="single" w:sz="4" w:color="D9D9D9"/>
@@ -9558,7 +9822,7 @@
             <w:r>
               <w:rPr>
                 <w:rFonts w:ascii="Calibri" w:hAnsi="Calibri"/>
-                <w:sz w:val="20"/>
+                <w:sz w:val="18"/>
               </w:rPr>
               <w:t>210</w:t>
             </w:r>
@@ -9566,7 +9830,7 @@
         </w:tc>
         <w:tc>
           <w:tcPr>
-            <w:tcW w:type="dxa" w:w="2268"/>
+            <w:tcW w:type="dxa" w:w="1814"/>
             <w:vAlign w:val="center"/>
             <w:tcBorders>
               <w:top w:val="single" w:sz="4" w:color="D9D9D9"/>
@@ -9590,9 +9854,41 @@
             <w:r>
               <w:rPr>
                 <w:rFonts w:ascii="Calibri" w:hAnsi="Calibri"/>
-                <w:sz w:val="20"/>
+                <w:sz w:val="18"/>
               </w:rPr>
               <w:t>190</w:t>
+            </w:r>
+          </w:p>
+        </w:tc>
+        <w:tc>
+          <w:tcPr>
+            <w:tcW w:type="dxa" w:w="1814"/>
+            <w:vAlign w:val="center"/>
+            <w:tcBorders>
+              <w:top w:val="single" w:sz="4" w:color="D9D9D9"/>
+              <w:left w:val="single" w:sz="4" w:color="D9D9D9"/>
+              <w:bottom w:val="single" w:sz="4" w:color="D9D9D9"/>
+              <w:right w:val="single" w:sz="4" w:color="D9D9D9"/>
+            </w:tcBorders>
+            <w:tcMar>
+              <w:top w:w="65" w:type="dxa"/>
+              <w:bottom w:w="65" w:type="dxa"/>
+              <w:left w:w="65" w:type="dxa"/>
+              <w:right w:w="65" w:type="dxa"/>
+            </w:tcMar>
+            <w:shd w:fill="F1F4F8"/>
+          </w:tcPr>
+          <w:p>
+            <w:pPr>
+              <w:spacing w:after="40" w:before="40" w:line="252" w:lineRule="auto"/>
+              <w:jc w:val="left"/>
+            </w:pPr>
+            <w:r>
+              <w:rPr>
+                <w:rFonts w:ascii="Calibri" w:hAnsi="Calibri"/>
+                <w:sz w:val="18"/>
+              </w:rPr>
+              <w:t>324</w:t>
             </w:r>
           </w:p>
         </w:tc>
@@ -9603,7 +9899,7 @@
         </w:trPr>
         <w:tc>
           <w:tcPr>
-            <w:tcW w:type="dxa" w:w="4535"/>
+            <w:tcW w:type="dxa" w:w="3628"/>
             <w:vAlign w:val="center"/>
             <w:tcBorders>
               <w:top w:val="single" w:sz="4" w:color="D9D9D9"/>
@@ -9627,7 +9923,7 @@
             <w:r>
               <w:rPr>
                 <w:rFonts w:ascii="Calibri" w:hAnsi="Calibri"/>
-                <w:sz w:val="20"/>
+                <w:sz w:val="18"/>
               </w:rPr>
               <w:t>Precisión</w:t>
             </w:r>
@@ -9635,7 +9931,7 @@
         </w:tc>
         <w:tc>
           <w:tcPr>
-            <w:tcW w:type="dxa" w:w="2268"/>
+            <w:tcW w:type="dxa" w:w="1814"/>
             <w:vAlign w:val="center"/>
             <w:tcBorders>
               <w:top w:val="single" w:sz="4" w:color="D9D9D9"/>
@@ -9659,7 +9955,7 @@
             <w:r>
               <w:rPr>
                 <w:rFonts w:ascii="Calibri" w:hAnsi="Calibri"/>
-                <w:sz w:val="20"/>
+                <w:sz w:val="18"/>
               </w:rPr>
               <w:t>0,8756</w:t>
             </w:r>
@@ -9667,7 +9963,7 @@
         </w:tc>
         <w:tc>
           <w:tcPr>
-            <w:tcW w:type="dxa" w:w="2268"/>
+            <w:tcW w:type="dxa" w:w="1814"/>
             <w:vAlign w:val="center"/>
             <w:tcBorders>
               <w:top w:val="single" w:sz="4" w:color="D9D9D9"/>
@@ -9691,9 +9987,41 @@
             <w:r>
               <w:rPr>
                 <w:rFonts w:ascii="Calibri" w:hAnsi="Calibri"/>
-                <w:sz w:val="20"/>
+                <w:sz w:val="18"/>
               </w:rPr>
               <w:t>0,8861</w:t>
+            </w:r>
+          </w:p>
+        </w:tc>
+        <w:tc>
+          <w:tcPr>
+            <w:tcW w:type="dxa" w:w="1814"/>
+            <w:vAlign w:val="center"/>
+            <w:tcBorders>
+              <w:top w:val="single" w:sz="4" w:color="D9D9D9"/>
+              <w:left w:val="single" w:sz="4" w:color="D9D9D9"/>
+              <w:bottom w:val="single" w:sz="4" w:color="D9D9D9"/>
+              <w:right w:val="single" w:sz="4" w:color="D9D9D9"/>
+            </w:tcBorders>
+            <w:tcMar>
+              <w:top w:w="65" w:type="dxa"/>
+              <w:bottom w:w="65" w:type="dxa"/>
+              <w:left w:w="65" w:type="dxa"/>
+              <w:right w:w="65" w:type="dxa"/>
+            </w:tcMar>
+            <w:shd w:fill="FFFFFF"/>
+          </w:tcPr>
+          <w:p>
+            <w:pPr>
+              <w:spacing w:after="40" w:before="40" w:line="252" w:lineRule="auto"/>
+              <w:jc w:val="left"/>
+            </w:pPr>
+            <w:r>
+              <w:rPr>
+                <w:rFonts w:ascii="Calibri" w:hAnsi="Calibri"/>
+                <w:sz w:val="18"/>
+              </w:rPr>
+              <w:t>0,8217</w:t>
             </w:r>
           </w:p>
         </w:tc>
@@ -9704,7 +10032,7 @@
         </w:trPr>
         <w:tc>
           <w:tcPr>
-            <w:tcW w:type="dxa" w:w="4535"/>
+            <w:tcW w:type="dxa" w:w="3628"/>
             <w:vAlign w:val="center"/>
             <w:tcBorders>
               <w:top w:val="single" w:sz="4" w:color="D9D9D9"/>
@@ -9728,7 +10056,7 @@
             <w:r>
               <w:rPr>
                 <w:rFonts w:ascii="Calibri" w:hAnsi="Calibri"/>
-                <w:sz w:val="20"/>
+                <w:sz w:val="18"/>
               </w:rPr>
               <w:t>Recall total</w:t>
             </w:r>
@@ -9736,7 +10064,7 @@
         </w:tc>
         <w:tc>
           <w:tcPr>
-            <w:tcW w:type="dxa" w:w="2268"/>
+            <w:tcW w:type="dxa" w:w="1814"/>
             <w:vAlign w:val="center"/>
             <w:tcBorders>
               <w:top w:val="single" w:sz="4" w:color="D9D9D9"/>
@@ -9760,7 +10088,7 @@
             <w:r>
               <w:rPr>
                 <w:rFonts w:ascii="Calibri" w:hAnsi="Calibri"/>
-                <w:sz w:val="20"/>
+                <w:sz w:val="18"/>
               </w:rPr>
               <w:t>0,9468</w:t>
             </w:r>
@@ -9768,7 +10096,7 @@
         </w:tc>
         <w:tc>
           <w:tcPr>
-            <w:tcW w:type="dxa" w:w="2268"/>
+            <w:tcW w:type="dxa" w:w="1814"/>
             <w:vAlign w:val="center"/>
             <w:tcBorders>
               <w:top w:val="single" w:sz="4" w:color="D9D9D9"/>
@@ -9792,9 +10120,41 @@
             <w:r>
               <w:rPr>
                 <w:rFonts w:ascii="Calibri" w:hAnsi="Calibri"/>
-                <w:sz w:val="20"/>
+                <w:sz w:val="18"/>
               </w:rPr>
               <w:t>0,9468</w:t>
+            </w:r>
+          </w:p>
+        </w:tc>
+        <w:tc>
+          <w:tcPr>
+            <w:tcW w:type="dxa" w:w="1814"/>
+            <w:vAlign w:val="center"/>
+            <w:tcBorders>
+              <w:top w:val="single" w:sz="4" w:color="D9D9D9"/>
+              <w:left w:val="single" w:sz="4" w:color="D9D9D9"/>
+              <w:bottom w:val="single" w:sz="4" w:color="D9D9D9"/>
+              <w:right w:val="single" w:sz="4" w:color="D9D9D9"/>
+            </w:tcBorders>
+            <w:tcMar>
+              <w:top w:w="65" w:type="dxa"/>
+              <w:bottom w:w="65" w:type="dxa"/>
+              <w:left w:w="65" w:type="dxa"/>
+              <w:right w:w="65" w:type="dxa"/>
+            </w:tcMar>
+            <w:shd w:fill="F1F4F8"/>
+          </w:tcPr>
+          <w:p>
+            <w:pPr>
+              <w:spacing w:after="40" w:before="40" w:line="252" w:lineRule="auto"/>
+              <w:jc w:val="left"/>
+            </w:pPr>
+            <w:r>
+              <w:rPr>
+                <w:rFonts w:ascii="Calibri" w:hAnsi="Calibri"/>
+                <w:sz w:val="18"/>
+              </w:rPr>
+              <w:t>0,9564</w:t>
             </w:r>
           </w:p>
         </w:tc>
@@ -9805,7 +10165,7 @@
         </w:trPr>
         <w:tc>
           <w:tcPr>
-            <w:tcW w:type="dxa" w:w="4535"/>
+            <w:tcW w:type="dxa" w:w="3628"/>
             <w:vAlign w:val="center"/>
             <w:tcBorders>
               <w:top w:val="single" w:sz="4" w:color="D9D9D9"/>
@@ -9829,7 +10189,7 @@
             <w:r>
               <w:rPr>
                 <w:rFonts w:ascii="Calibri" w:hAnsi="Calibri"/>
-                <w:sz w:val="20"/>
+                <w:sz w:val="18"/>
               </w:rPr>
               <w:t>Recall difficult</w:t>
             </w:r>
@@ -9837,7 +10197,7 @@
         </w:tc>
         <w:tc>
           <w:tcPr>
-            <w:tcW w:type="dxa" w:w="2268"/>
+            <w:tcW w:type="dxa" w:w="1814"/>
             <w:vAlign w:val="center"/>
             <w:tcBorders>
               <w:top w:val="single" w:sz="4" w:color="D9D9D9"/>
@@ -9861,7 +10221,7 @@
             <w:r>
               <w:rPr>
                 <w:rFonts w:ascii="Calibri" w:hAnsi="Calibri"/>
-                <w:sz w:val="20"/>
+                <w:sz w:val="18"/>
               </w:rPr>
               <w:t>0,7529</w:t>
             </w:r>
@@ -9869,7 +10229,7 @@
         </w:tc>
         <w:tc>
           <w:tcPr>
-            <w:tcW w:type="dxa" w:w="2268"/>
+            <w:tcW w:type="dxa" w:w="1814"/>
             <w:vAlign w:val="center"/>
             <w:tcBorders>
               <w:top w:val="single" w:sz="4" w:color="D9D9D9"/>
@@ -9893,9 +10253,41 @@
             <w:r>
               <w:rPr>
                 <w:rFonts w:ascii="Calibri" w:hAnsi="Calibri"/>
-                <w:sz w:val="20"/>
+                <w:sz w:val="18"/>
               </w:rPr>
               <w:t>0,7451</w:t>
+            </w:r>
+          </w:p>
+        </w:tc>
+        <w:tc>
+          <w:tcPr>
+            <w:tcW w:type="dxa" w:w="1814"/>
+            <w:vAlign w:val="center"/>
+            <w:tcBorders>
+              <w:top w:val="single" w:sz="4" w:color="D9D9D9"/>
+              <w:left w:val="single" w:sz="4" w:color="D9D9D9"/>
+              <w:bottom w:val="single" w:sz="4" w:color="D9D9D9"/>
+              <w:right w:val="single" w:sz="4" w:color="D9D9D9"/>
+            </w:tcBorders>
+            <w:tcMar>
+              <w:top w:w="65" w:type="dxa"/>
+              <w:bottom w:w="65" w:type="dxa"/>
+              <w:left w:w="65" w:type="dxa"/>
+              <w:right w:w="65" w:type="dxa"/>
+            </w:tcMar>
+            <w:shd w:fill="FFFFFF"/>
+          </w:tcPr>
+          <w:p>
+            <w:pPr>
+              <w:spacing w:after="40" w:before="40" w:line="252" w:lineRule="auto"/>
+              <w:jc w:val="left"/>
+            </w:pPr>
+            <w:r>
+              <w:rPr>
+                <w:rFonts w:ascii="Calibri" w:hAnsi="Calibri"/>
+                <w:sz w:val="18"/>
+              </w:rPr>
+              <w:t>0,7804</w:t>
             </w:r>
           </w:p>
         </w:tc>
@@ -9906,7 +10298,7 @@
         </w:trPr>
         <w:tc>
           <w:tcPr>
-            <w:tcW w:type="dxa" w:w="4535"/>
+            <w:tcW w:type="dxa" w:w="3628"/>
             <w:vAlign w:val="center"/>
             <w:tcBorders>
               <w:top w:val="single" w:sz="4" w:color="D9D9D9"/>
@@ -9930,7 +10322,7 @@
             <w:r>
               <w:rPr>
                 <w:rFonts w:ascii="Calibri" w:hAnsi="Calibri"/>
-                <w:sz w:val="20"/>
+                <w:sz w:val="18"/>
               </w:rPr>
               <w:t>F1</w:t>
             </w:r>
@@ -9938,7 +10330,7 @@
         </w:tc>
         <w:tc>
           <w:tcPr>
-            <w:tcW w:type="dxa" w:w="2268"/>
+            <w:tcW w:type="dxa" w:w="1814"/>
             <w:vAlign w:val="center"/>
             <w:tcBorders>
               <w:top w:val="single" w:sz="4" w:color="D9D9D9"/>
@@ -9962,7 +10354,7 @@
             <w:r>
               <w:rPr>
                 <w:rFonts w:ascii="Calibri" w:hAnsi="Calibri"/>
-                <w:sz w:val="20"/>
+                <w:sz w:val="18"/>
               </w:rPr>
               <w:t>0,9098</w:t>
             </w:r>
@@ -9970,7 +10362,7 @@
         </w:tc>
         <w:tc>
           <w:tcPr>
-            <w:tcW w:type="dxa" w:w="2268"/>
+            <w:tcW w:type="dxa" w:w="1814"/>
             <w:vAlign w:val="center"/>
             <w:tcBorders>
               <w:top w:val="single" w:sz="4" w:color="D9D9D9"/>
@@ -9994,9 +10386,41 @@
             <w:r>
               <w:rPr>
                 <w:rFonts w:ascii="Calibri" w:hAnsi="Calibri"/>
-                <w:sz w:val="20"/>
+                <w:sz w:val="18"/>
               </w:rPr>
               <w:t>0,9155</w:t>
+            </w:r>
+          </w:p>
+        </w:tc>
+        <w:tc>
+          <w:tcPr>
+            <w:tcW w:type="dxa" w:w="1814"/>
+            <w:vAlign w:val="center"/>
+            <w:tcBorders>
+              <w:top w:val="single" w:sz="4" w:color="D9D9D9"/>
+              <w:left w:val="single" w:sz="4" w:color="D9D9D9"/>
+              <w:bottom w:val="single" w:sz="4" w:color="D9D9D9"/>
+              <w:right w:val="single" w:sz="4" w:color="D9D9D9"/>
+            </w:tcBorders>
+            <w:tcMar>
+              <w:top w:w="65" w:type="dxa"/>
+              <w:bottom w:w="65" w:type="dxa"/>
+              <w:left w:w="65" w:type="dxa"/>
+              <w:right w:w="65" w:type="dxa"/>
+            </w:tcMar>
+            <w:shd w:fill="F1F4F8"/>
+          </w:tcPr>
+          <w:p>
+            <w:pPr>
+              <w:spacing w:after="40" w:before="40" w:line="252" w:lineRule="auto"/>
+              <w:jc w:val="left"/>
+            </w:pPr>
+            <w:r>
+              <w:rPr>
+                <w:rFonts w:ascii="Calibri" w:hAnsi="Calibri"/>
+                <w:sz w:val="18"/>
+              </w:rPr>
+              <w:t>0,8840</w:t>
             </w:r>
           </w:p>
         </w:tc>
@@ -10014,7 +10438,7 @@
     </w:p>
     <w:p>
       <w:r>
-        <w:t>El cambio reduce 20 FP y detecta dos normales adicionales, pero pierde dos difficult más; el TP total no cambia. Que AP difficult suba a 0,6462 mientras baja su recall a confianza 0,5 es compatible: el AP recorre confianzas y también depende de la ordenación y las cajas.</w:t>
+        <w:t>El cambio de tasa reduce 20 FP y detecta dos normales adicionales, pero pierde dos difficult más; el TP total no cambia. Que AP difficult suba a 0,6462 mientras baja su recall a confianza 0,5 es compatible: el AP recorre confianzas y también depende de la ordenación y las cajas.</w:t>
       </w:r>
     </w:p>
     <w:p>
@@ -10069,7 +10493,7 @@
     </w:p>
     <w:p>
       <w:r>
-        <w:t>El mejor F1 muestreado pasa de 0,95 a 0,85. Son muestras cada 0,05, no una estimación exacta del óptimo, y el modelo definitivo requerirá elegir su propio umbral según el coste de errores en la demo. Se midieron 72,7 ms por imagen en lote y 75,1 ms una a una; no incluyen captura, red ni actuación del robot.</w:t>
+        <w:t>El mejor F1 muestreado pasa de 0,95 a 0,85 con lr001 y vuelve a 0,95 con res1024. La rejilla termina en 0,95 y no determina el óptimo exacto. A confianza 0,5, res1024 detecta 15 robots más, nueve difficult, pero añade 134 FP y reduce F1. La latencia individual sube de 75,1 a 121,6 ms; no incluye captura, red ni actuación.</w:t>
       </w:r>
     </w:p>
     <w:p>
@@ -11766,6 +12190,1167 @@
     </w:p>
     <w:p>
       <w:pPr>
+        <w:pStyle w:val="Heading2"/>
+        <w:pageBreakBefore/>
+      </w:pPr>
+      <w:r>
+        <w:t>11.5. Resolución y evolución del entrenamiento</w:t>
+      </w:r>
+    </w:p>
+    <w:p>
+      <w:r>
+        <w:t>La propuesta de Alejandro se ejecutó desde COCO con lr=0,001 y aumento base, elevando min_size/max_size de 800/1333 a 1024/1820. Un frame pasa aproximadamente de 1333 × 750 a 1820 × 1024, un 86 % más de píxeles. Para memoria se usaron microbatch 4 y acumulación 2, frente a lote físico 8. No son idénticos numéricamente: pueden cambiar propuestas y redondeos.</w:t>
+      </w:r>
+    </w:p>
+    <w:p>
+      <w:pPr>
+        <w:keepNext/>
+        <w:jc w:val="center"/>
+      </w:pPr>
+      <w:r>
+        <w:drawing>
+          <wp:inline xmlns:a="http://schemas.openxmlformats.org/drawingml/2006/main" xmlns:pic="http://schemas.openxmlformats.org/drawingml/2006/picture">
+            <wp:extent cx="5600000" cy="3600000"/>
+            <wp:docPr id="13" name="Picture 13"/>
+            <wp:cNvGraphicFramePr>
+              <a:graphicFrameLocks noChangeAspect="1"/>
+            </wp:cNvGraphicFramePr>
+            <a:graphic>
+              <a:graphicData uri="http://schemas.openxmlformats.org/drawingml/2006/picture">
+                <pic:pic>
+                  <pic:nvPicPr>
+                    <pic:cNvPr id="0" name="curvas_comparadas.png"/>
+                    <pic:cNvPicPr/>
+                  </pic:nvPicPr>
+                  <pic:blipFill>
+                    <a:blip r:embed="rId23"/>
+                    <a:stretch>
+                      <a:fillRect/>
+                    </a:stretch>
+                  </pic:blipFill>
+                  <pic:spPr>
+                    <a:xfrm>
+                      <a:off x="0" y="0"/>
+                      <a:ext cx="5600000" cy="3600000"/>
+                    </a:xfrm>
+                    <a:prstGeom prst="rect"/>
+                  </pic:spPr>
+                </pic:pic>
+              </a:graphicData>
+            </a:graphic>
+          </wp:inline>
+        </w:drawing>
+      </w:r>
+    </w:p>
+    <w:p>
+      <w:pPr>
+        <w:pStyle w:val="Caption"/>
+        <w:keepNext w:val="0"/>
+        <w:keepLines/>
+      </w:pPr>
+      <w:r>
+        <w:t>Figura 13. Misma semilla y datos. Los puntos marcan el máximo AP50 de cada historial, no el máximo AP promedio.</w:t>
+      </w:r>
+    </w:p>
+    <w:p>
+      <w:r>
+        <w:t>El mejor AP50 de res1024 es 0,946440 en la época 2. Su AP 0,50:0,95 es 0,605390; el máximo de esta otra métrica aparece en la época 5, con 0,632233 y AP50 0,942070. Se respeta el criterio predefinido AP50 y se evalúa model_best de la época 2, sin seleccionar retrospectivamente por otra métrica.</w:t>
+      </w:r>
+    </w:p>
+    <w:p>
+      <w:r>
+        <w:t>La pérdida de validación mínima es 0,215909 en la época 3 y termina en 0,232343, mientras la de entrenamiento baja a 0,073149. El AP50 final cae a 0,933510. Hay indicios de sobreajuste y estancamiento tras el óptimo temprano. ReduceLROnPlateau usa 0,001 en 1–9, 0,0001 en 10–15, 1e−5 en 16–21, 1e−6 en 22–27 y 1e−7 en 28–30; no recupera el máximo.</w:t>
+      </w:r>
+    </w:p>
+    <w:p>
+      <w:r>
+        <w:t>Entrenamiento y validación finalizaron el 16/10 hacia las 08:45 Europe/Madrid, salida 0, unas nueve horas desde el lanzamiento. El máximo de 8482 MiB reservados corresponde al preflight, no a una medición del pico de las 30 épocas. Se conservan conjuntos, scheduler y aumento; no se ha evaluado test.</w:t>
+      </w:r>
+    </w:p>
+    <w:p>
+      <w:pPr>
+        <w:pStyle w:val="Heading2"/>
+        <w:pageBreakBefore/>
+      </w:pPr>
+      <w:r>
+        <w:t>11.6. Resultado y coste de la resolución</w:t>
+      </w:r>
+    </w:p>
+    <w:tbl>
+      <w:tblPr>
+        <w:tblW w:type="auto" w:w="0"/>
+        <w:tblLayout w:type="fixed"/>
+        <w:tblLook w:firstColumn="1" w:firstRow="1" w:lastColumn="0" w:lastRow="0" w:noHBand="0" w:noVBand="1" w:val="04A0"/>
+      </w:tblPr>
+      <w:tblGrid>
+        <w:gridCol w:w="3969"/>
+        <w:gridCol w:w="1701"/>
+        <w:gridCol w:w="1701"/>
+        <w:gridCol w:w="1701"/>
+      </w:tblGrid>
+      <w:tr>
+        <w:trPr>
+          <w:cantSplit/>
+          <w:tblHeader/>
+        </w:trPr>
+        <w:tc>
+          <w:tcPr>
+            <w:tcW w:type="dxa" w:w="3969"/>
+            <w:vAlign w:val="center"/>
+            <w:tcBorders>
+              <w:top w:val="single" w:sz="4" w:color="D9D9D9"/>
+              <w:left w:val="single" w:sz="4" w:color="D9D9D9"/>
+              <w:bottom w:val="single" w:sz="4" w:color="D9D9D9"/>
+              <w:right w:val="single" w:sz="4" w:color="D9D9D9"/>
+            </w:tcBorders>
+            <w:tcMar>
+              <w:top w:w="65" w:type="dxa"/>
+              <w:bottom w:w="65" w:type="dxa"/>
+              <w:left w:w="65" w:type="dxa"/>
+              <w:right w:w="65" w:type="dxa"/>
+            </w:tcMar>
+            <w:shd w:fill="203B65"/>
+          </w:tcPr>
+          <w:p>
+            <w:pPr>
+              <w:spacing w:after="40" w:before="40" w:line="252" w:lineRule="auto"/>
+              <w:jc w:val="left"/>
+            </w:pPr>
+            <w:r>
+              <w:rPr>
+                <w:rFonts w:ascii="Calibri" w:hAnsi="Calibri"/>
+                <w:b/>
+                <w:color w:val="FFFFFF"/>
+                <w:sz w:val="18"/>
+              </w:rPr>
+              <w:t>Mejor por AP50 en validación</w:t>
+            </w:r>
+          </w:p>
+        </w:tc>
+        <w:tc>
+          <w:tcPr>
+            <w:tcW w:type="dxa" w:w="1701"/>
+            <w:vAlign w:val="center"/>
+            <w:tcBorders>
+              <w:top w:val="single" w:sz="4" w:color="D9D9D9"/>
+              <w:left w:val="single" w:sz="4" w:color="D9D9D9"/>
+              <w:bottom w:val="single" w:sz="4" w:color="D9D9D9"/>
+              <w:right w:val="single" w:sz="4" w:color="D9D9D9"/>
+            </w:tcBorders>
+            <w:tcMar>
+              <w:top w:w="65" w:type="dxa"/>
+              <w:bottom w:w="65" w:type="dxa"/>
+              <w:left w:w="65" w:type="dxa"/>
+              <w:right w:w="65" w:type="dxa"/>
+            </w:tcMar>
+            <w:shd w:fill="203B65"/>
+          </w:tcPr>
+          <w:p>
+            <w:pPr>
+              <w:spacing w:after="40" w:before="40" w:line="252" w:lineRule="auto"/>
+              <w:jc w:val="left"/>
+            </w:pPr>
+            <w:r>
+              <w:rPr>
+                <w:rFonts w:ascii="Calibri" w:hAnsi="Calibri"/>
+                <w:b/>
+                <w:color w:val="FFFFFF"/>
+                <w:sz w:val="18"/>
+              </w:rPr>
+              <w:t>lr001 800</w:t>
+            </w:r>
+          </w:p>
+        </w:tc>
+        <w:tc>
+          <w:tcPr>
+            <w:tcW w:type="dxa" w:w="1701"/>
+            <w:vAlign w:val="center"/>
+            <w:tcBorders>
+              <w:top w:val="single" w:sz="4" w:color="D9D9D9"/>
+              <w:left w:val="single" w:sz="4" w:color="D9D9D9"/>
+              <w:bottom w:val="single" w:sz="4" w:color="D9D9D9"/>
+              <w:right w:val="single" w:sz="4" w:color="D9D9D9"/>
+            </w:tcBorders>
+            <w:tcMar>
+              <w:top w:w="65" w:type="dxa"/>
+              <w:bottom w:w="65" w:type="dxa"/>
+              <w:left w:w="65" w:type="dxa"/>
+              <w:right w:w="65" w:type="dxa"/>
+            </w:tcMar>
+            <w:shd w:fill="203B65"/>
+          </w:tcPr>
+          <w:p>
+            <w:pPr>
+              <w:spacing w:after="40" w:before="40" w:line="252" w:lineRule="auto"/>
+              <w:jc w:val="left"/>
+            </w:pPr>
+            <w:r>
+              <w:rPr>
+                <w:rFonts w:ascii="Calibri" w:hAnsi="Calibri"/>
+                <w:b/>
+                <w:color w:val="FFFFFF"/>
+                <w:sz w:val="18"/>
+              </w:rPr>
+              <w:t>lr001 1024</w:t>
+            </w:r>
+          </w:p>
+        </w:tc>
+        <w:tc>
+          <w:tcPr>
+            <w:tcW w:type="dxa" w:w="1701"/>
+            <w:vAlign w:val="center"/>
+            <w:tcBorders>
+              <w:top w:val="single" w:sz="4" w:color="D9D9D9"/>
+              <w:left w:val="single" w:sz="4" w:color="D9D9D9"/>
+              <w:bottom w:val="single" w:sz="4" w:color="D9D9D9"/>
+              <w:right w:val="single" w:sz="4" w:color="D9D9D9"/>
+            </w:tcBorders>
+            <w:tcMar>
+              <w:top w:w="65" w:type="dxa"/>
+              <w:bottom w:w="65" w:type="dxa"/>
+              <w:left w:w="65" w:type="dxa"/>
+              <w:right w:w="65" w:type="dxa"/>
+            </w:tcMar>
+            <w:shd w:fill="203B65"/>
+          </w:tcPr>
+          <w:p>
+            <w:pPr>
+              <w:spacing w:after="40" w:before="40" w:line="252" w:lineRule="auto"/>
+              <w:jc w:val="left"/>
+            </w:pPr>
+            <w:r>
+              <w:rPr>
+                <w:rFonts w:ascii="Calibri" w:hAnsi="Calibri"/>
+                <w:b/>
+                <w:color w:val="FFFFFF"/>
+                <w:sz w:val="18"/>
+              </w:rPr>
+              <w:t>Cambio pp</w:t>
+            </w:r>
+          </w:p>
+        </w:tc>
+      </w:tr>
+      <w:tr>
+        <w:trPr>
+          <w:cantSplit/>
+        </w:trPr>
+        <w:tc>
+          <w:tcPr>
+            <w:tcW w:type="dxa" w:w="3969"/>
+            <w:vAlign w:val="center"/>
+            <w:tcBorders>
+              <w:top w:val="single" w:sz="4" w:color="D9D9D9"/>
+              <w:left w:val="single" w:sz="4" w:color="D9D9D9"/>
+              <w:bottom w:val="single" w:sz="4" w:color="D9D9D9"/>
+              <w:right w:val="single" w:sz="4" w:color="D9D9D9"/>
+            </w:tcBorders>
+            <w:tcMar>
+              <w:top w:w="65" w:type="dxa"/>
+              <w:bottom w:w="65" w:type="dxa"/>
+              <w:left w:w="65" w:type="dxa"/>
+              <w:right w:w="65" w:type="dxa"/>
+            </w:tcMar>
+            <w:shd w:fill="F1F4F8"/>
+          </w:tcPr>
+          <w:p>
+            <w:pPr>
+              <w:spacing w:after="40" w:before="40" w:line="252" w:lineRule="auto"/>
+              <w:jc w:val="left"/>
+            </w:pPr>
+            <w:r>
+              <w:rPr>
+                <w:rFonts w:ascii="Calibri" w:hAnsi="Calibri"/>
+                <w:sz w:val="18"/>
+              </w:rPr>
+              <w:t>AP50 todos</w:t>
+            </w:r>
+          </w:p>
+        </w:tc>
+        <w:tc>
+          <w:tcPr>
+            <w:tcW w:type="dxa" w:w="1701"/>
+            <w:vAlign w:val="center"/>
+            <w:tcBorders>
+              <w:top w:val="single" w:sz="4" w:color="D9D9D9"/>
+              <w:left w:val="single" w:sz="4" w:color="D9D9D9"/>
+              <w:bottom w:val="single" w:sz="4" w:color="D9D9D9"/>
+              <w:right w:val="single" w:sz="4" w:color="D9D9D9"/>
+            </w:tcBorders>
+            <w:tcMar>
+              <w:top w:w="65" w:type="dxa"/>
+              <w:bottom w:w="65" w:type="dxa"/>
+              <w:left w:w="65" w:type="dxa"/>
+              <w:right w:w="65" w:type="dxa"/>
+            </w:tcMar>
+            <w:shd w:fill="F1F4F8"/>
+          </w:tcPr>
+          <w:p>
+            <w:pPr>
+              <w:spacing w:after="40" w:before="40" w:line="252" w:lineRule="auto"/>
+              <w:jc w:val="left"/>
+            </w:pPr>
+            <w:r>
+              <w:rPr>
+                <w:rFonts w:ascii="Calibri" w:hAnsi="Calibri"/>
+                <w:sz w:val="18"/>
+              </w:rPr>
+              <w:t>0,9433</w:t>
+            </w:r>
+          </w:p>
+        </w:tc>
+        <w:tc>
+          <w:tcPr>
+            <w:tcW w:type="dxa" w:w="1701"/>
+            <w:vAlign w:val="center"/>
+            <w:tcBorders>
+              <w:top w:val="single" w:sz="4" w:color="D9D9D9"/>
+              <w:left w:val="single" w:sz="4" w:color="D9D9D9"/>
+              <w:bottom w:val="single" w:sz="4" w:color="D9D9D9"/>
+              <w:right w:val="single" w:sz="4" w:color="D9D9D9"/>
+            </w:tcBorders>
+            <w:tcMar>
+              <w:top w:w="65" w:type="dxa"/>
+              <w:bottom w:w="65" w:type="dxa"/>
+              <w:left w:w="65" w:type="dxa"/>
+              <w:right w:w="65" w:type="dxa"/>
+            </w:tcMar>
+            <w:shd w:fill="F1F4F8"/>
+          </w:tcPr>
+          <w:p>
+            <w:pPr>
+              <w:spacing w:after="40" w:before="40" w:line="252" w:lineRule="auto"/>
+              <w:jc w:val="left"/>
+            </w:pPr>
+            <w:r>
+              <w:rPr>
+                <w:rFonts w:ascii="Calibri" w:hAnsi="Calibri"/>
+                <w:sz w:val="18"/>
+              </w:rPr>
+              <w:t>0,9465</w:t>
+            </w:r>
+          </w:p>
+        </w:tc>
+        <w:tc>
+          <w:tcPr>
+            <w:tcW w:type="dxa" w:w="1701"/>
+            <w:vAlign w:val="center"/>
+            <w:tcBorders>
+              <w:top w:val="single" w:sz="4" w:color="D9D9D9"/>
+              <w:left w:val="single" w:sz="4" w:color="D9D9D9"/>
+              <w:bottom w:val="single" w:sz="4" w:color="D9D9D9"/>
+              <w:right w:val="single" w:sz="4" w:color="D9D9D9"/>
+            </w:tcBorders>
+            <w:tcMar>
+              <w:top w:w="65" w:type="dxa"/>
+              <w:bottom w:w="65" w:type="dxa"/>
+              <w:left w:w="65" w:type="dxa"/>
+              <w:right w:w="65" w:type="dxa"/>
+            </w:tcMar>
+            <w:shd w:fill="F1F4F8"/>
+          </w:tcPr>
+          <w:p>
+            <w:pPr>
+              <w:spacing w:after="40" w:before="40" w:line="252" w:lineRule="auto"/>
+              <w:jc w:val="left"/>
+            </w:pPr>
+            <w:r>
+              <w:rPr>
+                <w:rFonts w:ascii="Calibri" w:hAnsi="Calibri"/>
+                <w:sz w:val="18"/>
+              </w:rPr>
+              <w:t>+0,32</w:t>
+            </w:r>
+          </w:p>
+        </w:tc>
+      </w:tr>
+      <w:tr>
+        <w:trPr>
+          <w:cantSplit/>
+        </w:trPr>
+        <w:tc>
+          <w:tcPr>
+            <w:tcW w:type="dxa" w:w="3969"/>
+            <w:vAlign w:val="center"/>
+            <w:tcBorders>
+              <w:top w:val="single" w:sz="4" w:color="D9D9D9"/>
+              <w:left w:val="single" w:sz="4" w:color="D9D9D9"/>
+              <w:bottom w:val="single" w:sz="4" w:color="D9D9D9"/>
+              <w:right w:val="single" w:sz="4" w:color="D9D9D9"/>
+            </w:tcBorders>
+            <w:tcMar>
+              <w:top w:w="65" w:type="dxa"/>
+              <w:bottom w:w="65" w:type="dxa"/>
+              <w:left w:w="65" w:type="dxa"/>
+              <w:right w:w="65" w:type="dxa"/>
+            </w:tcMar>
+            <w:shd w:fill="FFFFFF"/>
+          </w:tcPr>
+          <w:p>
+            <w:pPr>
+              <w:spacing w:after="40" w:before="40" w:line="252" w:lineRule="auto"/>
+              <w:jc w:val="left"/>
+            </w:pPr>
+            <w:r>
+              <w:rPr>
+                <w:rFonts w:ascii="Calibri" w:hAnsi="Calibri"/>
+                <w:sz w:val="18"/>
+              </w:rPr>
+              <w:t>AP 0,50:0,95 todos</w:t>
+            </w:r>
+          </w:p>
+        </w:tc>
+        <w:tc>
+          <w:tcPr>
+            <w:tcW w:type="dxa" w:w="1701"/>
+            <w:vAlign w:val="center"/>
+            <w:tcBorders>
+              <w:top w:val="single" w:sz="4" w:color="D9D9D9"/>
+              <w:left w:val="single" w:sz="4" w:color="D9D9D9"/>
+              <w:bottom w:val="single" w:sz="4" w:color="D9D9D9"/>
+              <w:right w:val="single" w:sz="4" w:color="D9D9D9"/>
+            </w:tcBorders>
+            <w:tcMar>
+              <w:top w:w="65" w:type="dxa"/>
+              <w:bottom w:w="65" w:type="dxa"/>
+              <w:left w:w="65" w:type="dxa"/>
+              <w:right w:w="65" w:type="dxa"/>
+            </w:tcMar>
+            <w:shd w:fill="FFFFFF"/>
+          </w:tcPr>
+          <w:p>
+            <w:pPr>
+              <w:spacing w:after="40" w:before="40" w:line="252" w:lineRule="auto"/>
+              <w:jc w:val="left"/>
+            </w:pPr>
+            <w:r>
+              <w:rPr>
+                <w:rFonts w:ascii="Calibri" w:hAnsi="Calibri"/>
+                <w:sz w:val="18"/>
+              </w:rPr>
+              <w:t>0,6302</w:t>
+            </w:r>
+          </w:p>
+        </w:tc>
+        <w:tc>
+          <w:tcPr>
+            <w:tcW w:type="dxa" w:w="1701"/>
+            <w:vAlign w:val="center"/>
+            <w:tcBorders>
+              <w:top w:val="single" w:sz="4" w:color="D9D9D9"/>
+              <w:left w:val="single" w:sz="4" w:color="D9D9D9"/>
+              <w:bottom w:val="single" w:sz="4" w:color="D9D9D9"/>
+              <w:right w:val="single" w:sz="4" w:color="D9D9D9"/>
+            </w:tcBorders>
+            <w:tcMar>
+              <w:top w:w="65" w:type="dxa"/>
+              <w:bottom w:w="65" w:type="dxa"/>
+              <w:left w:w="65" w:type="dxa"/>
+              <w:right w:w="65" w:type="dxa"/>
+            </w:tcMar>
+            <w:shd w:fill="FFFFFF"/>
+          </w:tcPr>
+          <w:p>
+            <w:pPr>
+              <w:spacing w:after="40" w:before="40" w:line="252" w:lineRule="auto"/>
+              <w:jc w:val="left"/>
+            </w:pPr>
+            <w:r>
+              <w:rPr>
+                <w:rFonts w:ascii="Calibri" w:hAnsi="Calibri"/>
+                <w:sz w:val="18"/>
+              </w:rPr>
+              <w:t>0,6047</w:t>
+            </w:r>
+          </w:p>
+        </w:tc>
+        <w:tc>
+          <w:tcPr>
+            <w:tcW w:type="dxa" w:w="1701"/>
+            <w:vAlign w:val="center"/>
+            <w:tcBorders>
+              <w:top w:val="single" w:sz="4" w:color="D9D9D9"/>
+              <w:left w:val="single" w:sz="4" w:color="D9D9D9"/>
+              <w:bottom w:val="single" w:sz="4" w:color="D9D9D9"/>
+              <w:right w:val="single" w:sz="4" w:color="D9D9D9"/>
+            </w:tcBorders>
+            <w:tcMar>
+              <w:top w:w="65" w:type="dxa"/>
+              <w:bottom w:w="65" w:type="dxa"/>
+              <w:left w:w="65" w:type="dxa"/>
+              <w:right w:w="65" w:type="dxa"/>
+            </w:tcMar>
+            <w:shd w:fill="FFFFFF"/>
+          </w:tcPr>
+          <w:p>
+            <w:pPr>
+              <w:spacing w:after="40" w:before="40" w:line="252" w:lineRule="auto"/>
+              <w:jc w:val="left"/>
+            </w:pPr>
+            <w:r>
+              <w:rPr>
+                <w:rFonts w:ascii="Calibri" w:hAnsi="Calibri"/>
+                <w:sz w:val="18"/>
+              </w:rPr>
+              <w:t>−2,55</w:t>
+            </w:r>
+          </w:p>
+        </w:tc>
+      </w:tr>
+      <w:tr>
+        <w:trPr>
+          <w:cantSplit/>
+        </w:trPr>
+        <w:tc>
+          <w:tcPr>
+            <w:tcW w:type="dxa" w:w="3969"/>
+            <w:vAlign w:val="center"/>
+            <w:tcBorders>
+              <w:top w:val="single" w:sz="4" w:color="D9D9D9"/>
+              <w:left w:val="single" w:sz="4" w:color="D9D9D9"/>
+              <w:bottom w:val="single" w:sz="4" w:color="D9D9D9"/>
+              <w:right w:val="single" w:sz="4" w:color="D9D9D9"/>
+            </w:tcBorders>
+            <w:tcMar>
+              <w:top w:w="65" w:type="dxa"/>
+              <w:bottom w:w="65" w:type="dxa"/>
+              <w:left w:w="65" w:type="dxa"/>
+              <w:right w:w="65" w:type="dxa"/>
+            </w:tcMar>
+            <w:shd w:fill="F1F4F8"/>
+          </w:tcPr>
+          <w:p>
+            <w:pPr>
+              <w:spacing w:after="40" w:before="40" w:line="252" w:lineRule="auto"/>
+              <w:jc w:val="left"/>
+            </w:pPr>
+            <w:r>
+              <w:rPr>
+                <w:rFonts w:ascii="Calibri" w:hAnsi="Calibri"/>
+                <w:sz w:val="18"/>
+              </w:rPr>
+              <w:t>AP75 todos</w:t>
+            </w:r>
+          </w:p>
+        </w:tc>
+        <w:tc>
+          <w:tcPr>
+            <w:tcW w:type="dxa" w:w="1701"/>
+            <w:vAlign w:val="center"/>
+            <w:tcBorders>
+              <w:top w:val="single" w:sz="4" w:color="D9D9D9"/>
+              <w:left w:val="single" w:sz="4" w:color="D9D9D9"/>
+              <w:bottom w:val="single" w:sz="4" w:color="D9D9D9"/>
+              <w:right w:val="single" w:sz="4" w:color="D9D9D9"/>
+            </w:tcBorders>
+            <w:tcMar>
+              <w:top w:w="65" w:type="dxa"/>
+              <w:bottom w:w="65" w:type="dxa"/>
+              <w:left w:w="65" w:type="dxa"/>
+              <w:right w:w="65" w:type="dxa"/>
+            </w:tcMar>
+            <w:shd w:fill="F1F4F8"/>
+          </w:tcPr>
+          <w:p>
+            <w:pPr>
+              <w:spacing w:after="40" w:before="40" w:line="252" w:lineRule="auto"/>
+              <w:jc w:val="left"/>
+            </w:pPr>
+            <w:r>
+              <w:rPr>
+                <w:rFonts w:ascii="Calibri" w:hAnsi="Calibri"/>
+                <w:sz w:val="18"/>
+              </w:rPr>
+              <w:t>0,7460</w:t>
+            </w:r>
+          </w:p>
+        </w:tc>
+        <w:tc>
+          <w:tcPr>
+            <w:tcW w:type="dxa" w:w="1701"/>
+            <w:vAlign w:val="center"/>
+            <w:tcBorders>
+              <w:top w:val="single" w:sz="4" w:color="D9D9D9"/>
+              <w:left w:val="single" w:sz="4" w:color="D9D9D9"/>
+              <w:bottom w:val="single" w:sz="4" w:color="D9D9D9"/>
+              <w:right w:val="single" w:sz="4" w:color="D9D9D9"/>
+            </w:tcBorders>
+            <w:tcMar>
+              <w:top w:w="65" w:type="dxa"/>
+              <w:bottom w:w="65" w:type="dxa"/>
+              <w:left w:w="65" w:type="dxa"/>
+              <w:right w:w="65" w:type="dxa"/>
+            </w:tcMar>
+            <w:shd w:fill="F1F4F8"/>
+          </w:tcPr>
+          <w:p>
+            <w:pPr>
+              <w:spacing w:after="40" w:before="40" w:line="252" w:lineRule="auto"/>
+              <w:jc w:val="left"/>
+            </w:pPr>
+            <w:r>
+              <w:rPr>
+                <w:rFonts w:ascii="Calibri" w:hAnsi="Calibri"/>
+                <w:sz w:val="18"/>
+              </w:rPr>
+              <w:t>0,6990</w:t>
+            </w:r>
+          </w:p>
+        </w:tc>
+        <w:tc>
+          <w:tcPr>
+            <w:tcW w:type="dxa" w:w="1701"/>
+            <w:vAlign w:val="center"/>
+            <w:tcBorders>
+              <w:top w:val="single" w:sz="4" w:color="D9D9D9"/>
+              <w:left w:val="single" w:sz="4" w:color="D9D9D9"/>
+              <w:bottom w:val="single" w:sz="4" w:color="D9D9D9"/>
+              <w:right w:val="single" w:sz="4" w:color="D9D9D9"/>
+            </w:tcBorders>
+            <w:tcMar>
+              <w:top w:w="65" w:type="dxa"/>
+              <w:bottom w:w="65" w:type="dxa"/>
+              <w:left w:w="65" w:type="dxa"/>
+              <w:right w:w="65" w:type="dxa"/>
+            </w:tcMar>
+            <w:shd w:fill="F1F4F8"/>
+          </w:tcPr>
+          <w:p>
+            <w:pPr>
+              <w:spacing w:after="40" w:before="40" w:line="252" w:lineRule="auto"/>
+              <w:jc w:val="left"/>
+            </w:pPr>
+            <w:r>
+              <w:rPr>
+                <w:rFonts w:ascii="Calibri" w:hAnsi="Calibri"/>
+                <w:sz w:val="18"/>
+              </w:rPr>
+              <w:t>−4,70</w:t>
+            </w:r>
+          </w:p>
+        </w:tc>
+      </w:tr>
+      <w:tr>
+        <w:trPr>
+          <w:cantSplit/>
+        </w:trPr>
+        <w:tc>
+          <w:tcPr>
+            <w:tcW w:type="dxa" w:w="3969"/>
+            <w:vAlign w:val="center"/>
+            <w:tcBorders>
+              <w:top w:val="single" w:sz="4" w:color="D9D9D9"/>
+              <w:left w:val="single" w:sz="4" w:color="D9D9D9"/>
+              <w:bottom w:val="single" w:sz="4" w:color="D9D9D9"/>
+              <w:right w:val="single" w:sz="4" w:color="D9D9D9"/>
+            </w:tcBorders>
+            <w:tcMar>
+              <w:top w:w="65" w:type="dxa"/>
+              <w:bottom w:w="65" w:type="dxa"/>
+              <w:left w:w="65" w:type="dxa"/>
+              <w:right w:w="65" w:type="dxa"/>
+            </w:tcMar>
+            <w:shd w:fill="FFFFFF"/>
+          </w:tcPr>
+          <w:p>
+            <w:pPr>
+              <w:spacing w:after="40" w:before="40" w:line="252" w:lineRule="auto"/>
+              <w:jc w:val="left"/>
+            </w:pPr>
+            <w:r>
+              <w:rPr>
+                <w:rFonts w:ascii="Calibri" w:hAnsi="Calibri"/>
+                <w:sz w:val="18"/>
+              </w:rPr>
+              <w:t>AP50 difficult</w:t>
+            </w:r>
+          </w:p>
+        </w:tc>
+        <w:tc>
+          <w:tcPr>
+            <w:tcW w:type="dxa" w:w="1701"/>
+            <w:vAlign w:val="center"/>
+            <w:tcBorders>
+              <w:top w:val="single" w:sz="4" w:color="D9D9D9"/>
+              <w:left w:val="single" w:sz="4" w:color="D9D9D9"/>
+              <w:bottom w:val="single" w:sz="4" w:color="D9D9D9"/>
+              <w:right w:val="single" w:sz="4" w:color="D9D9D9"/>
+            </w:tcBorders>
+            <w:tcMar>
+              <w:top w:w="65" w:type="dxa"/>
+              <w:bottom w:w="65" w:type="dxa"/>
+              <w:left w:w="65" w:type="dxa"/>
+              <w:right w:w="65" w:type="dxa"/>
+            </w:tcMar>
+            <w:shd w:fill="FFFFFF"/>
+          </w:tcPr>
+          <w:p>
+            <w:pPr>
+              <w:spacing w:after="40" w:before="40" w:line="252" w:lineRule="auto"/>
+              <w:jc w:val="left"/>
+            </w:pPr>
+            <w:r>
+              <w:rPr>
+                <w:rFonts w:ascii="Calibri" w:hAnsi="Calibri"/>
+                <w:sz w:val="18"/>
+              </w:rPr>
+              <w:t>0,6462</w:t>
+            </w:r>
+          </w:p>
+        </w:tc>
+        <w:tc>
+          <w:tcPr>
+            <w:tcW w:type="dxa" w:w="1701"/>
+            <w:vAlign w:val="center"/>
+            <w:tcBorders>
+              <w:top w:val="single" w:sz="4" w:color="D9D9D9"/>
+              <w:left w:val="single" w:sz="4" w:color="D9D9D9"/>
+              <w:bottom w:val="single" w:sz="4" w:color="D9D9D9"/>
+              <w:right w:val="single" w:sz="4" w:color="D9D9D9"/>
+            </w:tcBorders>
+            <w:tcMar>
+              <w:top w:w="65" w:type="dxa"/>
+              <w:bottom w:w="65" w:type="dxa"/>
+              <w:left w:w="65" w:type="dxa"/>
+              <w:right w:w="65" w:type="dxa"/>
+            </w:tcMar>
+            <w:shd w:fill="FFFFFF"/>
+          </w:tcPr>
+          <w:p>
+            <w:pPr>
+              <w:spacing w:after="40" w:before="40" w:line="252" w:lineRule="auto"/>
+              <w:jc w:val="left"/>
+            </w:pPr>
+            <w:r>
+              <w:rPr>
+                <w:rFonts w:ascii="Calibri" w:hAnsi="Calibri"/>
+                <w:sz w:val="18"/>
+              </w:rPr>
+              <w:t>0,6282</w:t>
+            </w:r>
+          </w:p>
+        </w:tc>
+        <w:tc>
+          <w:tcPr>
+            <w:tcW w:type="dxa" w:w="1701"/>
+            <w:vAlign w:val="center"/>
+            <w:tcBorders>
+              <w:top w:val="single" w:sz="4" w:color="D9D9D9"/>
+              <w:left w:val="single" w:sz="4" w:color="D9D9D9"/>
+              <w:bottom w:val="single" w:sz="4" w:color="D9D9D9"/>
+              <w:right w:val="single" w:sz="4" w:color="D9D9D9"/>
+            </w:tcBorders>
+            <w:tcMar>
+              <w:top w:w="65" w:type="dxa"/>
+              <w:bottom w:w="65" w:type="dxa"/>
+              <w:left w:w="65" w:type="dxa"/>
+              <w:right w:w="65" w:type="dxa"/>
+            </w:tcMar>
+            <w:shd w:fill="FFFFFF"/>
+          </w:tcPr>
+          <w:p>
+            <w:pPr>
+              <w:spacing w:after="40" w:before="40" w:line="252" w:lineRule="auto"/>
+              <w:jc w:val="left"/>
+            </w:pPr>
+            <w:r>
+              <w:rPr>
+                <w:rFonts w:ascii="Calibri" w:hAnsi="Calibri"/>
+                <w:sz w:val="18"/>
+              </w:rPr>
+              <w:t>−1,80</w:t>
+            </w:r>
+          </w:p>
+        </w:tc>
+      </w:tr>
+      <w:tr>
+        <w:trPr>
+          <w:cantSplit/>
+        </w:trPr>
+        <w:tc>
+          <w:tcPr>
+            <w:tcW w:type="dxa" w:w="3969"/>
+            <w:vAlign w:val="center"/>
+            <w:tcBorders>
+              <w:top w:val="single" w:sz="4" w:color="D9D9D9"/>
+              <w:left w:val="single" w:sz="4" w:color="D9D9D9"/>
+              <w:bottom w:val="single" w:sz="4" w:color="D9D9D9"/>
+              <w:right w:val="single" w:sz="4" w:color="D9D9D9"/>
+            </w:tcBorders>
+            <w:tcMar>
+              <w:top w:w="65" w:type="dxa"/>
+              <w:bottom w:w="65" w:type="dxa"/>
+              <w:left w:w="65" w:type="dxa"/>
+              <w:right w:w="65" w:type="dxa"/>
+            </w:tcMar>
+            <w:shd w:fill="F1F4F8"/>
+          </w:tcPr>
+          <w:p>
+            <w:pPr>
+              <w:spacing w:after="40" w:before="40" w:line="252" w:lineRule="auto"/>
+              <w:jc w:val="left"/>
+            </w:pPr>
+            <w:r>
+              <w:rPr>
+                <w:rFonts w:ascii="Calibri" w:hAnsi="Calibri"/>
+                <w:sz w:val="18"/>
+              </w:rPr>
+              <w:t>AP small</w:t>
+            </w:r>
+          </w:p>
+        </w:tc>
+        <w:tc>
+          <w:tcPr>
+            <w:tcW w:type="dxa" w:w="1701"/>
+            <w:vAlign w:val="center"/>
+            <w:tcBorders>
+              <w:top w:val="single" w:sz="4" w:color="D9D9D9"/>
+              <w:left w:val="single" w:sz="4" w:color="D9D9D9"/>
+              <w:bottom w:val="single" w:sz="4" w:color="D9D9D9"/>
+              <w:right w:val="single" w:sz="4" w:color="D9D9D9"/>
+            </w:tcBorders>
+            <w:tcMar>
+              <w:top w:w="65" w:type="dxa"/>
+              <w:bottom w:w="65" w:type="dxa"/>
+              <w:left w:w="65" w:type="dxa"/>
+              <w:right w:w="65" w:type="dxa"/>
+            </w:tcMar>
+            <w:shd w:fill="F1F4F8"/>
+          </w:tcPr>
+          <w:p>
+            <w:pPr>
+              <w:spacing w:after="40" w:before="40" w:line="252" w:lineRule="auto"/>
+              <w:jc w:val="left"/>
+            </w:pPr>
+            <w:r>
+              <w:rPr>
+                <w:rFonts w:ascii="Calibri" w:hAnsi="Calibri"/>
+                <w:sz w:val="18"/>
+              </w:rPr>
+              <w:t>0,1182</w:t>
+            </w:r>
+          </w:p>
+        </w:tc>
+        <w:tc>
+          <w:tcPr>
+            <w:tcW w:type="dxa" w:w="1701"/>
+            <w:vAlign w:val="center"/>
+            <w:tcBorders>
+              <w:top w:val="single" w:sz="4" w:color="D9D9D9"/>
+              <w:left w:val="single" w:sz="4" w:color="D9D9D9"/>
+              <w:bottom w:val="single" w:sz="4" w:color="D9D9D9"/>
+              <w:right w:val="single" w:sz="4" w:color="D9D9D9"/>
+            </w:tcBorders>
+            <w:tcMar>
+              <w:top w:w="65" w:type="dxa"/>
+              <w:bottom w:w="65" w:type="dxa"/>
+              <w:left w:w="65" w:type="dxa"/>
+              <w:right w:w="65" w:type="dxa"/>
+            </w:tcMar>
+            <w:shd w:fill="F1F4F8"/>
+          </w:tcPr>
+          <w:p>
+            <w:pPr>
+              <w:spacing w:after="40" w:before="40" w:line="252" w:lineRule="auto"/>
+              <w:jc w:val="left"/>
+            </w:pPr>
+            <w:r>
+              <w:rPr>
+                <w:rFonts w:ascii="Calibri" w:hAnsi="Calibri"/>
+                <w:sz w:val="18"/>
+              </w:rPr>
+              <w:t>0,1886</w:t>
+            </w:r>
+          </w:p>
+        </w:tc>
+        <w:tc>
+          <w:tcPr>
+            <w:tcW w:type="dxa" w:w="1701"/>
+            <w:vAlign w:val="center"/>
+            <w:tcBorders>
+              <w:top w:val="single" w:sz="4" w:color="D9D9D9"/>
+              <w:left w:val="single" w:sz="4" w:color="D9D9D9"/>
+              <w:bottom w:val="single" w:sz="4" w:color="D9D9D9"/>
+              <w:right w:val="single" w:sz="4" w:color="D9D9D9"/>
+            </w:tcBorders>
+            <w:tcMar>
+              <w:top w:w="65" w:type="dxa"/>
+              <w:bottom w:w="65" w:type="dxa"/>
+              <w:left w:w="65" w:type="dxa"/>
+              <w:right w:w="65" w:type="dxa"/>
+            </w:tcMar>
+            <w:shd w:fill="F1F4F8"/>
+          </w:tcPr>
+          <w:p>
+            <w:pPr>
+              <w:spacing w:after="40" w:before="40" w:line="252" w:lineRule="auto"/>
+              <w:jc w:val="left"/>
+            </w:pPr>
+            <w:r>
+              <w:rPr>
+                <w:rFonts w:ascii="Calibri" w:hAnsi="Calibri"/>
+                <w:sz w:val="18"/>
+              </w:rPr>
+              <w:t>+7,04</w:t>
+            </w:r>
+          </w:p>
+        </w:tc>
+      </w:tr>
+      <w:tr>
+        <w:trPr>
+          <w:cantSplit/>
+        </w:trPr>
+        <w:tc>
+          <w:tcPr>
+            <w:tcW w:type="dxa" w:w="3969"/>
+            <w:vAlign w:val="center"/>
+            <w:tcBorders>
+              <w:top w:val="single" w:sz="4" w:color="D9D9D9"/>
+              <w:left w:val="single" w:sz="4" w:color="D9D9D9"/>
+              <w:bottom w:val="single" w:sz="4" w:color="D9D9D9"/>
+              <w:right w:val="single" w:sz="4" w:color="D9D9D9"/>
+            </w:tcBorders>
+            <w:tcMar>
+              <w:top w:w="65" w:type="dxa"/>
+              <w:bottom w:w="65" w:type="dxa"/>
+              <w:left w:w="65" w:type="dxa"/>
+              <w:right w:w="65" w:type="dxa"/>
+            </w:tcMar>
+            <w:shd w:fill="FFFFFF"/>
+          </w:tcPr>
+          <w:p>
+            <w:pPr>
+              <w:spacing w:after="40" w:before="40" w:line="252" w:lineRule="auto"/>
+              <w:jc w:val="left"/>
+            </w:pPr>
+            <w:r>
+              <w:rPr>
+                <w:rFonts w:ascii="Calibri" w:hAnsi="Calibri"/>
+                <w:sz w:val="18"/>
+              </w:rPr>
+              <w:t>AP large</w:t>
+            </w:r>
+          </w:p>
+        </w:tc>
+        <w:tc>
+          <w:tcPr>
+            <w:tcW w:type="dxa" w:w="1701"/>
+            <w:vAlign w:val="center"/>
+            <w:tcBorders>
+              <w:top w:val="single" w:sz="4" w:color="D9D9D9"/>
+              <w:left w:val="single" w:sz="4" w:color="D9D9D9"/>
+              <w:bottom w:val="single" w:sz="4" w:color="D9D9D9"/>
+              <w:right w:val="single" w:sz="4" w:color="D9D9D9"/>
+            </w:tcBorders>
+            <w:tcMar>
+              <w:top w:w="65" w:type="dxa"/>
+              <w:bottom w:w="65" w:type="dxa"/>
+              <w:left w:w="65" w:type="dxa"/>
+              <w:right w:w="65" w:type="dxa"/>
+            </w:tcMar>
+            <w:shd w:fill="FFFFFF"/>
+          </w:tcPr>
+          <w:p>
+            <w:pPr>
+              <w:spacing w:after="40" w:before="40" w:line="252" w:lineRule="auto"/>
+              <w:jc w:val="left"/>
+            </w:pPr>
+            <w:r>
+              <w:rPr>
+                <w:rFonts w:ascii="Calibri" w:hAnsi="Calibri"/>
+                <w:sz w:val="18"/>
+              </w:rPr>
+              <w:t>0,6919</w:t>
+            </w:r>
+          </w:p>
+        </w:tc>
+        <w:tc>
+          <w:tcPr>
+            <w:tcW w:type="dxa" w:w="1701"/>
+            <w:vAlign w:val="center"/>
+            <w:tcBorders>
+              <w:top w:val="single" w:sz="4" w:color="D9D9D9"/>
+              <w:left w:val="single" w:sz="4" w:color="D9D9D9"/>
+              <w:bottom w:val="single" w:sz="4" w:color="D9D9D9"/>
+              <w:right w:val="single" w:sz="4" w:color="D9D9D9"/>
+            </w:tcBorders>
+            <w:tcMar>
+              <w:top w:w="65" w:type="dxa"/>
+              <w:bottom w:w="65" w:type="dxa"/>
+              <w:left w:w="65" w:type="dxa"/>
+              <w:right w:w="65" w:type="dxa"/>
+            </w:tcMar>
+            <w:shd w:fill="FFFFFF"/>
+          </w:tcPr>
+          <w:p>
+            <w:pPr>
+              <w:spacing w:after="40" w:before="40" w:line="252" w:lineRule="auto"/>
+              <w:jc w:val="left"/>
+            </w:pPr>
+            <w:r>
+              <w:rPr>
+                <w:rFonts w:ascii="Calibri" w:hAnsi="Calibri"/>
+                <w:sz w:val="18"/>
+              </w:rPr>
+              <w:t>0,6459</w:t>
+            </w:r>
+          </w:p>
+        </w:tc>
+        <w:tc>
+          <w:tcPr>
+            <w:tcW w:type="dxa" w:w="1701"/>
+            <w:vAlign w:val="center"/>
+            <w:tcBorders>
+              <w:top w:val="single" w:sz="4" w:color="D9D9D9"/>
+              <w:left w:val="single" w:sz="4" w:color="D9D9D9"/>
+              <w:bottom w:val="single" w:sz="4" w:color="D9D9D9"/>
+              <w:right w:val="single" w:sz="4" w:color="D9D9D9"/>
+            </w:tcBorders>
+            <w:tcMar>
+              <w:top w:w="65" w:type="dxa"/>
+              <w:bottom w:w="65" w:type="dxa"/>
+              <w:left w:w="65" w:type="dxa"/>
+              <w:right w:w="65" w:type="dxa"/>
+            </w:tcMar>
+            <w:shd w:fill="FFFFFF"/>
+          </w:tcPr>
+          <w:p>
+            <w:pPr>
+              <w:spacing w:after="40" w:before="40" w:line="252" w:lineRule="auto"/>
+              <w:jc w:val="left"/>
+            </w:pPr>
+            <w:r>
+              <w:rPr>
+                <w:rFonts w:ascii="Calibri" w:hAnsi="Calibri"/>
+                <w:sz w:val="18"/>
+              </w:rPr>
+              <w:t>−4,60</w:t>
+            </w:r>
+          </w:p>
+        </w:tc>
+      </w:tr>
+    </w:tbl>
+    <w:p>
+      <w:pPr>
+        <w:pStyle w:val="Caption"/>
+        <w:keepNext w:val="0"/>
+        <w:keepLines/>
+      </w:pPr>
+      <w:r>
+        <w:t>Tabla 12. Evaluación final del checkpoint seleccionado. El historial se presenta por separado.</w:t>
+      </w:r>
+    </w:p>
+    <w:p>
+      <w:pPr>
+        <w:keepNext/>
+        <w:jc w:val="center"/>
+      </w:pPr>
+      <w:r>
+        <w:drawing>
+          <wp:inline xmlns:a="http://schemas.openxmlformats.org/drawingml/2006/main" xmlns:pic="http://schemas.openxmlformats.org/drawingml/2006/picture">
+            <wp:extent cx="5724000" cy="1908000"/>
+            <wp:docPr id="14" name="Picture 14"/>
+            <wp:cNvGraphicFramePr>
+              <a:graphicFrameLocks noChangeAspect="1"/>
+            </wp:cNvGraphicFramePr>
+            <a:graphic>
+              <a:graphicData uri="http://schemas.openxmlformats.org/drawingml/2006/picture">
+                <pic:pic>
+                  <pic:nvPicPr>
+                    <pic:cNvPr id="0" name="precision_y_coste.png"/>
+                    <pic:cNvPicPr/>
+                  </pic:nvPicPr>
+                  <pic:blipFill>
+                    <a:blip r:embed="rId24"/>
+                    <a:stretch>
+                      <a:fillRect/>
+                    </a:stretch>
+                  </pic:blipFill>
+                  <pic:spPr>
+                    <a:xfrm>
+                      <a:off x="0" y="0"/>
+                      <a:ext cx="5724000" cy="1908000"/>
+                    </a:xfrm>
+                    <a:prstGeom prst="rect"/>
+                  </pic:spPr>
+                </pic:pic>
+              </a:graphicData>
+            </a:graphic>
+          </wp:inline>
+        </w:drawing>
+      </w:r>
+    </w:p>
+    <w:p>
+      <w:pPr>
+        <w:pStyle w:val="Caption"/>
+        <w:keepNext w:val="0"/>
+        <w:keepLines/>
+      </w:pPr>
+      <w:r>
+        <w:t>Figura 14. La mejora de pequeños convive con retrocesos en otras métricas y mayor latencia individual.</w:t>
+      </w:r>
+    </w:p>
+    <w:p>
+      <w:r>
+        <w:t>La inferencia individual tarda 121,6 frente a 75,1 ms, +61,9 %, aproximadamente 8,2 frente a 13,3 imágenes/s solo de inferencia. En lote son 120,5 frente a 72,7 ms/imagen, pero con lotes distintos de 4 y 8. La comparación individual es más directa; ninguna cifra mide la demo completa.</w:t>
+      </w:r>
+    </w:p>
+    <w:p>
+      <w:pPr>
+        <w:keepNext/>
+        <w:jc w:val="center"/>
+      </w:pPr>
+      <w:r>
+        <w:drawing>
+          <wp:inline xmlns:a="http://schemas.openxmlformats.org/drawingml/2006/main" xmlns:pic="http://schemas.openxmlformats.org/drawingml/2006/picture">
+            <wp:extent cx="3960000" cy="1980000"/>
+            <wp:docPr id="15" name="Picture 15"/>
+            <wp:cNvGraphicFramePr>
+              <a:graphicFrameLocks noChangeAspect="1"/>
+            </wp:cNvGraphicFramePr>
+            <a:graphic>
+              <a:graphicData uri="http://schemas.openxmlformats.org/drawingml/2006/picture">
+                <pic:pic>
+                  <pic:nvPicPr>
+                    <pic:cNvPr id="0" name="secuencias_comparadas.png"/>
+                    <pic:cNvPicPr/>
+                  </pic:nvPicPr>
+                  <pic:blipFill>
+                    <a:blip r:embed="rId25"/>
+                    <a:stretch>
+                      <a:fillRect/>
+                    </a:stretch>
+                  </pic:blipFill>
+                  <pic:spPr>
+                    <a:xfrm>
+                      <a:off x="0" y="0"/>
+                      <a:ext cx="3960000" cy="1980000"/>
+                    </a:xfrm>
+                    <a:prstGeom prst="rect"/>
+                  </pic:spPr>
+                </pic:pic>
+              </a:graphicData>
+            </a:graphic>
+          </wp:inline>
+        </w:drawing>
+      </w:r>
+    </w:p>
+    <w:p>
+      <w:pPr>
+        <w:pStyle w:val="Caption"/>
+        <w:keepNext w:val="0"/>
+        <w:keepLines/>
+      </w:pPr>
+      <w:r>
+        <w:t>Figura 15. Cambio de AP50 frente a lr001 a resolución original; escala en puntos porcentuales.</w:t>
+      </w:r>
+    </w:p>
+    <w:p>
+      <w:r>
+        <w:t>AP50 mejora en 4 secuencias, baja en 6 y empata en una. GR03_0011 de 2025 gana 4,16 puntos y reduce FN de 28 a 22. GR04_0011 de 2025 reduce FN de 33 a 25, pero FP sube de 28 a 58. GR01_0002 de 2025 pierde 1,20 puntos. GR04_0003 de 2024 sigue perdiendo sus seis difficult. El CSV complementario conserva todas las secuencias.</w:t>
+      </w:r>
+    </w:p>
+    <w:p>
+      <w:pPr>
         <w:pStyle w:val="Heading1"/>
         <w:pageBreakBefore/>
       </w:pPr>
@@ -11787,7 +13372,7 @@
         <w:drawing>
           <wp:inline xmlns:a="http://schemas.openxmlformats.org/drawingml/2006/main" xmlns:pic="http://schemas.openxmlformats.org/drawingml/2006/picture">
             <wp:extent cx="5194613" cy="3131999"/>
-            <wp:docPr id="13" name="Picture 13"/>
+            <wp:docPr id="16" name="Picture 16"/>
             <wp:cNvGraphicFramePr>
               <a:graphicFrameLocks noChangeAspect="1"/>
             </wp:cNvGraphicFramePr>
@@ -11799,7 +13384,7 @@
                     <pic:cNvPicPr/>
                   </pic:nvPicPr>
                   <pic:blipFill>
-                    <a:blip r:embed="rId23"/>
+                    <a:blip r:embed="rId26"/>
                     <a:stretch>
                       <a:fillRect/>
                     </a:stretch>
@@ -11825,12 +13410,12 @@
         <w:keepLines/>
       </w:pPr>
       <w:r>
-        <w:t>Figura 13. Caso confirmado de anotación incompleta. La caja azul es la única del XML.</w:t>
+        <w:t>Figura 16. Caso confirmado de anotación incompleta. La caja azul es la única del XML.</w:t>
       </w:r>
     </w:p>
     <w:p>
       <w:r>
-        <w:t>Esto limita la interpretación de los 190 FP y de precisión, F1 y AP calculados contra esas etiquetas. No se ha cuantificado la extensión del problema y no se atribuyen todos los FP a omisiones. En GR02_0001 quedan 49 FP frente a etiquetas y ningún FN, señal de que el recuento necesita contexto visual.</w:t>
+        <w:t>Esto limita la interpretación de los 190 FP de lr001 y los 324 de res1024, y de precisión, F1 y AP. No se ha cuantificado la extensión del problema ni se atribuyen todos los FP a omisiones. GR02_0001 pasa de 49 a 71 FP frente a etiquetas; no son necesariamente errores visuales nuevos.</w:t>
       </w:r>
     </w:p>
     <w:p>
@@ -11841,8 +13426,8 @@
       <w:r>
         <w:drawing>
           <wp:inline xmlns:a="http://schemas.openxmlformats.org/drawingml/2006/main" xmlns:pic="http://schemas.openxmlformats.org/drawingml/2006/picture">
-            <wp:extent cx="3579250" cy="2160000"/>
-            <wp:docPr id="14" name="Picture 14"/>
+            <wp:extent cx="3857142" cy="2160000"/>
+            <wp:docPr id="17" name="Picture 17"/>
             <wp:cNvGraphicFramePr>
               <a:graphicFrameLocks noChangeAspect="1"/>
             </wp:cNvGraphicFramePr>
@@ -11850,11 +13435,11 @@
               <a:graphicData uri="http://schemas.openxmlformats.org/drawingml/2006/picture">
                 <pic:pic>
                   <pic:nvPicPr>
-                    <pic:cNvPr id="0" name="caso_peores.png"/>
+                    <pic:cNvPr id="0" name="ejemplo_errores_res1024.png"/>
                     <pic:cNvPicPr/>
                   </pic:nvPicPr>
                   <pic:blipFill>
-                    <a:blip r:embed="rId24"/>
+                    <a:blip r:embed="rId27"/>
                     <a:stretch>
                       <a:fillRect/>
                     </a:stretch>
@@ -11862,7 +13447,7 @@
                   <pic:spPr>
                     <a:xfrm>
                       <a:off x="0" y="0"/>
-                      <a:ext cx="3579250" cy="2160000"/>
+                      <a:ext cx="3857142" cy="2160000"/>
                     </a:xfrm>
                     <a:prstGeom prst="rect"/>
                   </pic:spPr>
@@ -11880,12 +13465,12 @@
         <w:keepLines/>
       </w:pPr>
       <w:r>
-        <w:t>Figura 14. Una muestra de las imágenes con más errores de lr001; verde indica emparejamiento correcto y rojo detección sin pareja.</w:t>
+        <w:t>Figura 17. Res1024 en PIDS2025_GR03_0011/frame_0600: TP 4, FP 4 y FN 1 frente a las etiquetas; rojo indica detección sin pareja.</w:t>
       </w:r>
     </w:p>
     <w:p>
       <w:r>
-        <w:t>Los difficult concentran 65 de los 83 FN. El desenfoque, los tamaños pequeños y la oclusión observados en los datos siguen requiriendo atención. Sus causas se contrastan con muestras, porque el flag difficult agrupa condiciones distintas.</w:t>
+        <w:t>La muestra de res1024 incluye una caja roja sobre una pierna y varias cajas solapadas en torno a un objetivo: las etiquetas omitidas no explican todos los errores. Los difficult concentran 65/83 FN de lr001 y 56/68 de res1024. Su recall al umbral 0,5 mejora, pero no su AP50 agregado; el flag agrupa tamaños, oclusión y movimiento.</w:t>
       </w:r>
     </w:p>
     <w:p>
@@ -11899,27 +13484,22 @@
     </w:p>
     <w:p>
       <w:r>
-        <w:t>Se adopta provisionalmente lr=0,001 y el checkpoint de la época 5 como referencia del próximo experimento: mejora AP agregado, ajuste de cajas y FP, con una latencia similar. La diferencia de +0,17 puntos en AP50 con una única semilla no prueba una mejora estable; tampoco hay mejora uniforme en difficult al umbral fijo.</w:t>
+        <w:t>Se conserva provisionalmente lr=0,001 a resolución 800/1333 y el checkpoint de la época 5 como referencia: mejora AP agregado, ajuste de cajas y FP frente a lr=0,0001, con una latencia similar. La diferencia de +0,17 puntos en AP50 con una única semilla no prueba una mejora estable; tampoco hay mejora uniforme en difficult al umbral fijo.</w:t>
       </w:r>
     </w:p>
     <w:p>
       <w:r>
-        <w:t>Se han completado tres entrenamientos y su evaluación en validación. El orden seguido anticipó la comparación con aumento y luego ajustó la tasa sobre ese conjunto. Aún no se ha completado la comparación de arquitecturas ni la evaluación final en test que requiere el Bloque 2; estos informes son un avance de esa fase.</w:t>
+        <w:t>Se han completado cuatro entrenamientos y su evaluación en validación. La resolución mayor aporta +7,04 puntos de AP small y reduce 15 FN, pero aumenta FP y latencia y baja AP 0,50:0,95 en el checkpoint seleccionado. Se conserva lr001 a resolución original como referencia por su equilibrio; res1024 queda como alternativa si prima detectar pequeños y se acepta ese coste.</w:t>
       </w:r>
     </w:p>
     <w:p>
       <w:r>
-        <w:t>La propuesta prioritaria de Alejandro es aumentar la resolución interna a min_size=1024 y max_size=1820, con lr=0,001 y aumento base. Para un frame 1280 × 720 pasa aproximadamente de 1333 × 750 a 1820 × 1024, un 86 % más de píxeles. Se debe medir el efecto en AP small, difficult, memoria y latencia, aplicando la misma resolución durante evaluación.</w:t>
+        <w:t>La selección por AP50 tiene consecuencias: en res1024 el máximo AP 0,50:0,95 del historial está en la época 5, no en la 2 elegida. No se ha reevaluado otro checkpoint ni se concluye que la resolución empeore siempre el ajuste de cajas. Una semilla y el cambio de microbatch impiden aislar completamente su efecto.</w:t>
       </w:r>
     </w:p>
     <w:p>
       <w:r>
-        <w:t>Una resolución mayor puede exigir microbatches y acumulación para conservar un lote efectivo de 8 en los 12 GB de la RTX 3060. Esa adaptación de memoria debe documentarse; no se mezcla con otra arquitectura, MultiStepLR ni los nuevos perfiles de lluvia, sombras y oclusión. Si no mejora, el resultado negativo también servirá para decidir.</w:t>
-      </w:r>
-    </w:p>
-    <w:p>
-      <w:r>
-        <w:t>Después se revisarán ejemplos de errores y, si hay margen de laboratorio, Faster R-CNN v2 o una ampliación dirigida a difficult. Se limitará el número de decisiones sobre validación. Modelo y umbral se fijarán antes de usar test una sola vez, sin prometer funcionamiento bajo lluvia real con datos sintéticos.</w:t>
+        <w:t>Falta comparar arquitecturas y evaluar el modelo definitivo en test; la fase 2 sigue siendo un avance. Como experimento posterior se plantea una ampliación dirigida a difficult, con los demás parámetros fijos. Los perfiles de sombras, lluvia y oclusión están preparados, pero no participan en estos resultados. Se limita la selección sobre validación y test se reserva para una única evaluación final.</w:t>
       </w:r>
     </w:p>
     <w:p>

</xml_diff>

<commit_message>
Añade a la memoria las figuras de coste, tasa de aprendizaje y errores en test
Tres figuras estáticas nuevas (minutos y mejor época de los 13 entrenamientos,
curvas de las tres tasas, errores de test con curvas de umbral del modelo final),
con su texto y la referencia a las figuras interactivas de GitHub Pages. Se quitan
dos saltos de página que dejaban huecos y se regeneran Word, Markdown y PDF.
</commit_message>
<xml_diff>
--- a/docs/informes/informe_completo_fases_1_2.docx
+++ b/docs/informes/informe_completo_fases_1_2.docx
@@ -12983,7 +12983,7 @@
     </w:p>
     <w:p>
       <w:r>
-        <w:t>Se entrenaron las siete arquitecturas del código de partida, todas inicializadas con COCO y con la cabeza sustituida por fondo y robot: Faster R-CNN ResNet-50 FPN en sus versiones v1 y v2 y con MobileNetV3, RetinaNet ResNet-50 FPN (v1 y v2), SSD300 con VGG16 y SSDlite320 con MobileNetV3 [3,4,6,7]. Todas usan el perfil de aumento robusto_v1 (las 796 originales y tres copias por imagen), 12 épocas, SGD con tasa 0,001 y semilla 0, y se conserva el checkpoint con mayor AP@0,5 en validación.</w:t>
+        <w:t>Se entrenaron las siete arquitecturas del código de partida, todas inicializadas con COCO y con la cabeza sustituida por fondo y robot: Faster R-CNN ResNet-50 FPN en sus versiones v1 y v2 y con MobileNetV3, RetinaNet ResNet-50 FPN (v1 y v2), SSD300 con VGG16 y SSDlite320 con MobileNetV3 [3,4,6,7]. Todas usan el perfil de aumento robusto_v1 (las 796 originales y tres copias por imagen), 12 épocas, SGD con tasa 0,001 y semilla 0, y se conserva el checkpoint con mayor AP@0,5 en validación. Las figuras interactivas de esta comparación, con selectores de medida, modelo y conjunto, están en https://javiersaguar.github.io/PIDS-Proyecto2/bloque2/.</w:t>
       </w:r>
     </w:p>
     <w:tbl>
@@ -15488,6 +15488,61 @@
       </w:r>
     </w:p>
     <w:p>
+      <w:pPr>
+        <w:keepNext/>
+        <w:jc w:val="center"/>
+      </w:pPr>
+      <w:r>
+        <w:drawing>
+          <wp:inline xmlns:a="http://schemas.openxmlformats.org/drawingml/2006/main" xmlns:pic="http://schemas.openxmlformats.org/drawingml/2006/picture">
+            <wp:extent cx="4123636" cy="2160000"/>
+            <wp:docPr id="18" name="Picture 18"/>
+            <wp:cNvGraphicFramePr>
+              <a:graphicFrameLocks noChangeAspect="1"/>
+            </wp:cNvGraphicFramePr>
+            <a:graphic>
+              <a:graphicData uri="http://schemas.openxmlformats.org/drawingml/2006/picture">
+                <pic:pic>
+                  <pic:nvPicPr>
+                    <pic:cNvPr id="0" name="coste_entrenamiento.png"/>
+                    <pic:cNvPicPr/>
+                  </pic:nvPicPr>
+                  <pic:blipFill>
+                    <a:blip r:embed="rId28"/>
+                    <a:stretch>
+                      <a:fillRect/>
+                    </a:stretch>
+                  </pic:blipFill>
+                  <pic:spPr>
+                    <a:xfrm>
+                      <a:off x="0" y="0"/>
+                      <a:ext cx="4123636" cy="2160000"/>
+                    </a:xfrm>
+                    <a:prstGeom prst="rect"/>
+                  </pic:spPr>
+                </pic:pic>
+              </a:graphicData>
+            </a:graphic>
+          </wp:inline>
+        </w:drawing>
+      </w:r>
+    </w:p>
+    <w:p>
+      <w:pPr>
+        <w:pStyle w:val="Caption"/>
+        <w:keepNext w:val="0"/>
+        <w:keepLines/>
+      </w:pPr>
+      <w:r>
+        <w:t>Figura 18. Minutos de entrenamiento de los 13 entrenamientos y época del mejor checkpoint (rombo). Los minutos hasta el mejor checkpoint son una estimación: minutos totales por mejor época entre épocas, suponiendo épocas de igual duración.</w:t>
+      </w:r>
+    </w:p>
+    <w:p>
+      <w:r>
+        <w:t>El coste también separa a las arquitecturas. Los 13 entrenamientos suman 1306 minutos, unas 21,8 horas de GPU. Faster R-CNN v2 es la más cara (151 minutos con 12 épocas y 189 con 15, con lote 4 y acumulación 2 para caber en memoria) y Faster R-CNN con MobileNet cuesta 19. RetinaNet v2 es la que más memoria necesita (10.550 MiB, frente a 7462 de Faster R-CNN v2), y SSD300 y SSDlite320 caben en poco más de 1 GiB. Con lr 0,001 el mejor checkpoint llega en las épocas 3 (v2), 5 (v1) y 6 (RetinaNet v2), de modo que entre el 50 % y el 75 % del tiempo posterior no mejora el checkpoint elegido.</w:t>
+      </w:r>
+    </w:p>
+    <w:p>
       <w:r>
         <w:t>Las curvas muestran dos comportamientos. Faster R-CNN alcanza el máximo en las épocas 3 a 5 y después pierde entre 0,6 y 1 punto mientras su pérdida de entrenamiento sigue bajando: sobreajuste temprano, como en los experimentos anteriores. RetinaNet arranca más despacio (RetinaNet v1 está en 0,48 en la primera época) pero es más estable y llega al máximo en las épocas 6 y 7. SSD300 sigue mejorando en la época 12, por lo que doce épocas pueden ser pocas para ese modelo; no se probó con más.</w:t>
       </w:r>
@@ -15500,7 +15555,6 @@
     <w:p>
       <w:pPr>
         <w:pStyle w:val="Heading2"/>
-        <w:pageBreakBefore/>
       </w:pPr>
       <w:r>
         <w:t>11.8. Tasa de aprendizaje y perfil de aumento</w:t>
@@ -17843,6 +17897,56 @@
       </w:r>
     </w:p>
     <w:p>
+      <w:pPr>
+        <w:keepNext/>
+        <w:jc w:val="center"/>
+      </w:pPr>
+      <w:r>
+        <w:drawing>
+          <wp:inline xmlns:a="http://schemas.openxmlformats.org/drawingml/2006/main" xmlns:pic="http://schemas.openxmlformats.org/drawingml/2006/picture">
+            <wp:extent cx="4300000" cy="1800000"/>
+            <wp:docPr id="19" name="Picture 19"/>
+            <wp:cNvGraphicFramePr>
+              <a:graphicFrameLocks noChangeAspect="1"/>
+            </wp:cNvGraphicFramePr>
+            <a:graphic>
+              <a:graphicData uri="http://schemas.openxmlformats.org/drawingml/2006/picture">
+                <pic:pic>
+                  <pic:nvPicPr>
+                    <pic:cNvPr id="0" name="tasa_aprendizaje.png"/>
+                    <pic:cNvPicPr/>
+                  </pic:nvPicPr>
+                  <pic:blipFill>
+                    <a:blip r:embed="rId29"/>
+                    <a:stretch>
+                      <a:fillRect/>
+                    </a:stretch>
+                  </pic:blipFill>
+                  <pic:spPr>
+                    <a:xfrm>
+                      <a:off x="0" y="0"/>
+                      <a:ext cx="4300000" cy="1800000"/>
+                    </a:xfrm>
+                    <a:prstGeom prst="rect"/>
+                  </pic:spPr>
+                </pic:pic>
+              </a:graphicData>
+            </a:graphic>
+          </wp:inline>
+        </w:drawing>
+      </w:r>
+    </w:p>
+    <w:p>
+      <w:pPr>
+        <w:pStyle w:val="Caption"/>
+        <w:keepNext w:val="0"/>
+        <w:keepLines/>
+      </w:pPr>
+      <w:r>
+        <w:t>Figura 19. AP@0,5 en validación por época con tres tasas de aprendizaje. El rombo marca el mejor checkpoint de cada curva; con 0,0005 hay 15 épocas. Las primeras épocas de algunas curvas quedan fuera de escala.</w:t>
+      </w:r>
+    </w:p>
+    <w:p>
       <w:r>
         <w:t>Lo que sí cambia es la estabilidad. Con 0,002, Faster R-CNN alcanza su máximo en la primera o la segunda época y después pierde entre 1,1 y 1,4 puntos: de 0,9497 a 0,9355 en la v2 y de 0,9432 a 0,9320 en la v1. Con 0,0005 el máximo llega más tarde (época 5 en la v2) y la caída posterior es de 0,5 puntos. RetinaNet v2 es poco sensible a la tasa. Que el mejor checkpoint con lr 0,002 sea el de una sola época indica que apenas se ha entrenado, y recuerda que cada cifra es el máximo de una curva y por tanto algo optimista.</w:t>
       </w:r>
@@ -17860,7 +17964,6 @@
     <w:p>
       <w:pPr>
         <w:pStyle w:val="Heading2"/>
-        <w:pageBreakBefore/>
       </w:pPr>
       <w:r>
         <w:t>11.9. Evaluación final en test</w:t>
@@ -20789,7 +20892,7 @@
         <w:drawing>
           <wp:inline xmlns:a="http://schemas.openxmlformats.org/drawingml/2006/main" xmlns:pic="http://schemas.openxmlformats.org/drawingml/2006/picture">
             <wp:extent cx="5274418" cy="2268000"/>
-            <wp:docPr id="18" name="Picture 18"/>
+            <wp:docPr id="20" name="Picture 20"/>
             <wp:cNvGraphicFramePr>
               <a:graphicFrameLocks noChangeAspect="1"/>
             </wp:cNvGraphicFramePr>
@@ -20801,7 +20904,7 @@
                     <pic:cNvPicPr/>
                   </pic:nvPicPr>
                   <pic:blipFill>
-                    <a:blip r:embed="rId28"/>
+                    <a:blip r:embed="rId30"/>
                     <a:stretch>
                       <a:fillRect/>
                     </a:stretch>
@@ -20827,12 +20930,67 @@
         <w:keepLines/>
       </w:pPr>
       <w:r>
-        <w:t>Figura 18. AP@0,5 en validación y en test. El orden de las arquitecturas se mantiene; las de SSD pierden más al pasar a test.</w:t>
+        <w:t>Figura 20. AP@0,5 en validación y en test. El orden de las arquitecturas se mantiene; las de SSD pierden más al pasar a test.</w:t>
       </w:r>
     </w:p>
     <w:p>
       <w:r>
         <w:t>El modelo final, Faster R-CNN v2 con lr 0,001, obtiene en test un AP@0,5 de 0,9523 (0,9513 en validación): 0,9658 en robots normales y 0,6921 en difficult. Con el umbral 0,95 detecta 1606 de los 1721 robots (exhaustividad 0,9332, y 0,7259 en difficult), con 94 falsos positivos (precisión 0,9447) y un F1 de 0,9389. El mejor F1 posible en test sería 0,9413, con umbral 0,90: el umbral elegido en validación queda a 0,24 puntos del óptimo.</w:t>
+      </w:r>
+    </w:p>
+    <w:p>
+      <w:pPr>
+        <w:keepNext/>
+        <w:jc w:val="center"/>
+      </w:pPr>
+      <w:r>
+        <w:drawing>
+          <wp:inline xmlns:a="http://schemas.openxmlformats.org/drawingml/2006/main" xmlns:pic="http://schemas.openxmlformats.org/drawingml/2006/picture">
+            <wp:extent cx="4334400" cy="2016000"/>
+            <wp:docPr id="21" name="Picture 21"/>
+            <wp:cNvGraphicFramePr>
+              <a:graphicFrameLocks noChangeAspect="1"/>
+            </wp:cNvGraphicFramePr>
+            <a:graphic>
+              <a:graphicData uri="http://schemas.openxmlformats.org/drawingml/2006/picture">
+                <pic:pic>
+                  <pic:nvPicPr>
+                    <pic:cNvPr id="0" name="errores_test.png"/>
+                    <pic:cNvPicPr/>
+                  </pic:nvPicPr>
+                  <pic:blipFill>
+                    <a:blip r:embed="rId31"/>
+                    <a:stretch>
+                      <a:fillRect/>
+                    </a:stretch>
+                  </pic:blipFill>
+                  <pic:spPr>
+                    <a:xfrm>
+                      <a:off x="0" y="0"/>
+                      <a:ext cx="4334400" cy="2016000"/>
+                    </a:xfrm>
+                    <a:prstGeom prst="rect"/>
+                  </pic:spPr>
+                </pic:pic>
+              </a:graphicData>
+            </a:graphic>
+          </wp:inline>
+        </w:drawing>
+      </w:r>
+    </w:p>
+    <w:p>
+      <w:pPr>
+        <w:pStyle w:val="Caption"/>
+        <w:keepNext w:val="0"/>
+        <w:keepLines/>
+      </w:pPr>
+      <w:r>
+        <w:t>Figura 21. Errores en test con el umbral fijado en validación (izquierda) y curvas de umbral del modelo final (derecha); la línea punteada es el umbral elegido.</w:t>
+      </w:r>
+    </w:p>
+    <w:p>
+      <w:r>
+        <w:t>En test, 74 de los 115 robots que pierde el modelo final (64 %) son difficult, que son 270 de 1721 (16 %). Las SSD fallan sobre todo por robots perdidos (307 y 691). Subir el umbral de 0,5 a 0,95 baja los falsos positivos de 226 a 94, pero la exhaustividad en difficult cae de 0,84 a 0,73: el umbral decide cuántos difficult se sacrifican.</w:t>
       </w:r>
     </w:p>
     <w:p>
@@ -20873,7 +21031,7 @@
         <w:drawing>
           <wp:inline xmlns:a="http://schemas.openxmlformats.org/drawingml/2006/main" xmlns:pic="http://schemas.openxmlformats.org/drawingml/2006/picture">
             <wp:extent cx="5194613" cy="3131999"/>
-            <wp:docPr id="19" name="Picture 19"/>
+            <wp:docPr id="22" name="Picture 22"/>
             <wp:cNvGraphicFramePr>
               <a:graphicFrameLocks noChangeAspect="1"/>
             </wp:cNvGraphicFramePr>
@@ -20885,7 +21043,7 @@
                     <pic:cNvPicPr/>
                   </pic:nvPicPr>
                   <pic:blipFill>
-                    <a:blip r:embed="rId29"/>
+                    <a:blip r:embed="rId32"/>
                     <a:stretch>
                       <a:fillRect/>
                     </a:stretch>
@@ -20911,7 +21069,7 @@
         <w:keepLines/>
       </w:pPr>
       <w:r>
-        <w:t>Figura 19. Caso confirmado de anotación incompleta. La caja azul es la única del XML.</w:t>
+        <w:t>Figura 22. Caso confirmado de anotación incompleta. La caja azul es la única del XML.</w:t>
       </w:r>
     </w:p>
     <w:p>
@@ -20928,7 +21086,7 @@
         <w:drawing>
           <wp:inline xmlns:a="http://schemas.openxmlformats.org/drawingml/2006/main" xmlns:pic="http://schemas.openxmlformats.org/drawingml/2006/picture">
             <wp:extent cx="3857142" cy="2160000"/>
-            <wp:docPr id="20" name="Picture 20"/>
+            <wp:docPr id="23" name="Picture 23"/>
             <wp:cNvGraphicFramePr>
               <a:graphicFrameLocks noChangeAspect="1"/>
             </wp:cNvGraphicFramePr>
@@ -20940,7 +21098,7 @@
                     <pic:cNvPicPr/>
                   </pic:nvPicPr>
                   <pic:blipFill>
-                    <a:blip r:embed="rId30"/>
+                    <a:blip r:embed="rId33"/>
                     <a:stretch>
                       <a:fillRect/>
                     </a:stretch>
@@ -20966,7 +21124,7 @@
         <w:keepLines/>
       </w:pPr>
       <w:r>
-        <w:t>Figura 20. Res1024 en PIDS2025_GR03_0011/frame_0600: TP 4, FP 4 y FN 1 frente a las etiquetas; rojo indica detección sin pareja.</w:t>
+        <w:t>Figura 23. Res1024 en PIDS2025_GR03_0011/frame_0600: TP 4, FP 4 y FN 1 frente a las etiquetas; rojo indica detección sin pareja.</w:t>
       </w:r>
     </w:p>
     <w:p>

</xml_diff>